<commit_message>
Tier worked-examples doc: add EARLY_TRAIL + MFE/MAE coverage
- Mental Model section now defines MFE / MAE and explains the
  EARLY_TRAIL_PCT (+10%) rule end-to-end.
- Each tier section gets a new Scenario F (early-trail save) showing
  rupee-by-rupee P&L on a +11% pop / reverse, plus a comparison to the
  -1R outcome you'd get without the rule.
- Side-by-side table adds an EARLY_TRAIL row and a Scenario F row.
- High-ATR (8% ATR) walkthrough now demonstrates where the rule earns
  its keep most: 1st partial at +32-48%, so the trail arms WAY before
  any formal target.
- New Section 9 explains how MFE/MAE feed into eventual tuning
  decisions after 30-60 days of data.
</commit_message>
<xml_diff>
--- a/algo-tier-worked-examples.docx
+++ b/algo-tier-worked-examples.docx
@@ -24,7 +24,7 @@
           <w:color w:val="64748B"/>
           <w:sz w:val="22"/>
         </w:rPr>
-        <w:t>Every number, every milestone, every tier — with actual rupees</w:t>
+        <w:t>v2 — includes EARLY_TRAIL_PCT (+10%) safety net and MFE/MAE tracking</w:t>
       </w:r>
     </w:p>
     <w:p/>
@@ -42,7 +42,7 @@
           <w:b/>
           <w:i w:val="0"/>
         </w:rPr>
-        <w:t>Three numbers drive everything that follows. Memorize these:</w:t>
+        <w:t>Five concepts drive everything that follows:</w:t>
       </w:r>
     </w:p>
     <w:p>
@@ -54,11 +54,42 @@
           <w:rFonts w:ascii="Consolas" w:hAnsi="Consolas"/>
           <w:sz w:val="19"/>
         </w:rPr>
-        <w:t>R          = entry_price − initial_stop      (per-share risk in ₹)</w:t>
+        <w:t>R                = entry_price − initial_stop      (per-share risk in ₹)</w:t>
         <w:br/>
-        <w:t>stop_dist  = 2 × ATR_14                       (= 1R, by construction)</w:t>
+        <w:t>stop_dist        = 2 × ATR_14                       (= 1R, by construction)</w:t>
         <w:br/>
-        <w:t>SLEEVE     = ₹25,00,000                       (fixed paper capital)</w:t>
+        <w:t>SLEEVE           = ₹25,00,000                       (fixed paper capital)</w:t>
+        <w:br/>
+        <w:t>EARLY_TRAIL_PCT  = 10.0                             (MFE threshold to arm trailing stop)</w:t>
+        <w:br/>
+        <w:t>trail_stop       = close − 2 × ATR_14               (ratchets up daily, never down)</w:t>
+      </w:r>
+    </w:p>
+    <w:p>
+      <w:r>
+        <w:rPr>
+          <w:b/>
+          <w:i w:val="0"/>
+        </w:rPr>
+        <w:t>Two new terms you'll see in the dashboard:</w:t>
+      </w:r>
+    </w:p>
+    <w:p>
+      <w:pPr>
+        <w:pStyle w:val="ListBullet"/>
+        <w:ind w:left="340"/>
+      </w:pPr>
+      <w:r>
+        <w:t>MFE — Maximum Favorable Excursion. The highest unrealized % gain ever reached during a trade. Tells you 'how good did this trade get?'</w:t>
+      </w:r>
+    </w:p>
+    <w:p>
+      <w:pPr>
+        <w:pStyle w:val="ListBullet"/>
+        <w:ind w:left="340"/>
+      </w:pPr>
+      <w:r>
+        <w:t>MAE — Maximum Adverse Excursion. The lowest unrealized % loss ever reached. Tells you 'how much pain did you sit through?'</w:t>
       </w:r>
     </w:p>
     <w:p>
@@ -67,7 +98,16 @@
           <w:b w:val="0"/>
           <w:i w:val="0"/>
         </w:rPr>
-        <w:t>Because stop_dist is fixed at 2×ATR, R is always equal to 2×ATR. So every R-multiple in the strategy translates directly into an ATR multiple of distance:</w:t>
+        <w:t>Both are captured daily as bar-high vs entry (MFE) and bar-low vs entry (MAE) by `paper_trader.py:process_exits`. Stored in `paper_trades.max_unrealized_pct` and `min_unrealized_pct`. After 30-60 days of paper trades we use the MFE distribution to answer questions like: 'of trades that never hit the 1st partial target, what % peaked above +10%?' That tells us whether our R-targets are calibrated or whether we're leaving money on the table.</w:t>
+      </w:r>
+    </w:p>
+    <w:p>
+      <w:r>
+        <w:rPr>
+          <w:b w:val="0"/>
+          <w:i w:val="0"/>
+        </w:rPr>
+        <w:t>Because stop_dist is fixed at 2×ATR, R always equals 2×ATR. So every R-multiple in the strategy translates directly into an ATR multiple of distance from entry:</w:t>
       </w:r>
     </w:p>
     <w:tbl>
@@ -331,6 +371,99 @@
         </w:tc>
       </w:tr>
     </w:tbl>
+    <w:p>
+      <w:pPr>
+        <w:pStyle w:val="Heading2"/>
+      </w:pPr>
+      <w:r>
+        <w:t>The EARLY_TRAIL_PCT safety net (added 2026-05-15)</w:t>
+      </w:r>
+    </w:p>
+    <w:p>
+      <w:r>
+        <w:rPr>
+          <w:b w:val="0"/>
+          <w:i w:val="0"/>
+        </w:rPr>
+        <w:t>Problem the rule solves: for high-ATR names, the R-target ladder sits far above entry. SAIL with 2 ATR = 6.7% has its T1 1st partial at +20% — meaning a trade that ran to +12% and reversed all the way back used to hit the initial stop at −6.7%. The fix:</w:t>
+      </w:r>
+    </w:p>
+    <w:p>
+      <w:pPr>
+        <w:ind w:left="227"/>
+      </w:pPr>
+      <w:r>
+        <w:rPr>
+          <w:rFonts w:ascii="Consolas" w:hAnsi="Consolas"/>
+          <w:sz w:val="19"/>
+        </w:rPr>
+        <w:t>Inside process_exits, AFTER R-partial check, BEFORE trail update:</w:t>
+        <w:br/>
+        <w:t xml:space="preserve">  if not trail_armed and max_unrealized_pct &gt;= 10.0:</w:t>
+        <w:br/>
+        <w:t xml:space="preserve">      trail_armed = True</w:t>
+        <w:br/>
+        <w:t xml:space="preserve">      trail_armed_reason = 'pct_threshold'</w:t>
+        <w:br/>
+        <w:t xml:space="preserve">      current_stop = max(current_stop, entry_price)   # floor at entry</w:t>
+        <w:br/>
+        <w:br/>
+        <w:t>Then the regular daily trail update runs:</w:t>
+        <w:br/>
+        <w:t xml:space="preserve">  if trail_armed:</w:t>
+        <w:br/>
+        <w:t xml:space="preserve">      new_stop = close − 2 × ATR_14</w:t>
+        <w:br/>
+        <w:t xml:space="preserve">      if new_stop &gt; current_stop:</w:t>
+        <w:br/>
+        <w:t xml:space="preserve">          current_stop = new_stop</w:t>
+      </w:r>
+    </w:p>
+    <w:p>
+      <w:r>
+        <w:rPr>
+          <w:b/>
+          <w:i w:val="0"/>
+        </w:rPr>
+        <w:t>Important properties of this rule:</w:t>
+      </w:r>
+    </w:p>
+    <w:p>
+      <w:pPr>
+        <w:pStyle w:val="ListBullet"/>
+        <w:ind w:left="340"/>
+      </w:pPr>
+      <w:r>
+        <w:t>Does NOT book any profit. Just flips the trail switch and floors the stop at entry. r_multiple bookkeeping stays clean — a trade that exits at +9R is still recorded as +9R.</w:t>
+      </w:r>
+    </w:p>
+    <w:p>
+      <w:pPr>
+        <w:pStyle w:val="ListBullet"/>
+        <w:ind w:left="340"/>
+      </w:pPr>
+      <w:r>
+        <w:t>Is a no-op for low-ATR names where the formal 1st partial fires below +10%. There, the partial arms breakeven first and our rule arms nothing new.</w:t>
+      </w:r>
+    </w:p>
+    <w:p>
+      <w:pPr>
+        <w:pStyle w:val="ListBullet"/>
+        <w:ind w:left="340"/>
+      </w:pPr>
+      <w:r>
+        <w:t>Only bites when 1st formal partial sits above +10% (i.e., high-ATR stocks). That's the case it was designed for.</w:t>
+      </w:r>
+    </w:p>
+    <w:p>
+      <w:pPr>
+        <w:pStyle w:val="ListBullet"/>
+        <w:ind w:left="340"/>
+      </w:pPr>
+      <w:r>
+        <w:t>`trail_armed_reason` column ('partial_2' vs 'pct_threshold') lets us compare outcomes by trigger — critical for tuning.</w:t>
+      </w:r>
+    </w:p>
     <w:p>
       <w:r>
         <w:rPr>
@@ -684,6 +817,10 @@
         <w:t xml:space="preserve">  initial_stop            = ₹470.00</w:t>
         <w:br/>
         <w:t xml:space="preserve">  R                       = ₹30 per share</w:t>
+        <w:br/>
+        <w:t xml:space="preserve">  1R as % of entry        = 6.0%</w:t>
+        <w:br/>
+        <w:t xml:space="preserve">  EARLY_TRAIL trigger     = entry × 1.10 = ₹550.00</w:t>
       </w:r>
     </w:p>
     <w:p>
@@ -692,7 +829,7 @@
           <w:b/>
           <w:i w:val="0"/>
         </w:rPr>
-        <w:t>Five exit scenarios per tier:</w:t>
+        <w:t>Six exit scenarios per tier (one new since v1):</w:t>
       </w:r>
     </w:p>
     <w:p>
@@ -742,6 +879,15 @@
     </w:p>
     <w:p>
       <w:pPr>
+        <w:pStyle w:val="ListBullet"/>
+        <w:ind w:left="340"/>
+      </w:pPr>
+      <w:r>
+        <w:t>F — Early-trail save (NEW): pop to +11% then reverses BEFORE any formal R-partial. Without the +10% rule this would round-trip to −1R. With the rule, the trail arms, stop floors at entry, and we exit at a small profit on the trail next session.</w:t>
+      </w:r>
+    </w:p>
+    <w:p>
+      <w:pPr>
         <w:pStyle w:val="Heading1"/>
       </w:pPr>
       <w:r>
@@ -779,20 +925,11 @@
       </w:r>
     </w:p>
     <w:p>
-      <w:r>
-        <w:rPr>
-          <w:b w:val="0"/>
-          <w:i/>
-        </w:rPr>
-        <w:t>Cap binds → actual risk ₹18,000 (0.72%) is below the 1.50% target. Expected for low-ATR names — by design.</w:t>
-      </w:r>
-    </w:p>
-    <w:p>
       <w:pPr>
         <w:pStyle w:val="Heading2"/>
       </w:pPr>
       <w:r>
-        <w:t>Stop loss &amp; R-multiple ladder</w:t>
+        <w:t>Stop, R ladder, and early-trail trigger</w:t>
       </w:r>
     </w:p>
     <w:p>
@@ -804,19 +941,30 @@
           <w:rFonts w:ascii="Consolas" w:hAnsi="Consolas"/>
           <w:sz w:val="19"/>
         </w:rPr>
-        <w:t>initial_stop  = ₹500 − (2 × ₹15)  = ₹470.00</w:t>
+        <w:t>initial_stop  = ₹500 − (2 × ₹15)  = ₹470.00   (−6% / −1R)</w:t>
         <w:br/>
-        <w:t>R             = ₹500 − ₹470       = ₹30 per share</w:t>
+        <w:t>R             = ₹500 − ₹470       = ₹30 per share  (1R = 6.0% of entry)</w:t>
         <w:br/>
         <w:br/>
-        <w:t>1st partial:  +3R  → ₹500 + (3 × ₹30) = ₹590.00</w:t>
+        <w:t>1st partial:   +3R = ₹590.00  (+18.0%)</w:t>
         <w:br/>
-        <w:t>2nd partial:  +6R  → ₹500 + (6 × ₹30) = ₹680.00</w:t>
+        <w:t>2nd partial:   +6R = ₹680.00  (+36.0%)</w:t>
+        <w:br/>
+        <w:t>EARLY_TRAIL:   +10% = ₹550.00    ← fires BEFORE the 1st R-partial</w:t>
         <w:br/>
         <w:br/>
-        <w:t>partial_qty   = floor(600 × 33%) = 198 shares</w:t>
+        <w:t>partial_qty   = floor(600 × 33%) = 198 shares per R-partial</w:t>
         <w:br/>
         <w:t>residual_qty  = 600 − 2 × 198 = 204 shares (trails)</w:t>
+      </w:r>
+    </w:p>
+    <w:p>
+      <w:r>
+        <w:rPr>
+          <w:b w:val="0"/>
+          <w:i/>
+        </w:rPr>
+        <w:t>Because 1st formal partial sits at +18.0% (above +10%), the EARLY_TRAIL rule will fire FIRST on any trade that crosses +10%. The trail arms and the stop floors at entry well before the formal partial target.</w:t>
       </w:r>
     </w:p>
     <w:p>
@@ -833,7 +981,7 @@
           <w:b w:val="0"/>
           <w:i w:val="0"/>
         </w:rPr>
-        <w:t>At +3R (₹590.00) → 1st partial; stop → breakeven. At +6R (₹680.00) → 2nd partial; trail armed. Residual trails out at +9R (₹770).</w:t>
+        <w:t>Price rallies. At +10% (₹550), EARLY_TRAIL arms early — stop floors at entry, trail starts ratcheting daily. At ₹590.00 (+3R) the 1st partial fires. At ₹680.00 (+6R) the 2nd partial fires. Residual 204 shares ride the trail until it catches at ~+9R (₹770).</w:t>
       </w:r>
     </w:p>
     <w:tbl>
@@ -917,6 +1065,73 @@
                 <w:sz w:val="20"/>
               </w:rPr>
               <w:t>Cumulative P&amp;L</w:t>
+            </w:r>
+          </w:p>
+        </w:tc>
+      </w:tr>
+      <w:tr>
+        <w:tc>
+          <w:tcPr>
+            <w:tcW w:type="dxa" w:w="3402"/>
+          </w:tcPr>
+          <w:p>
+            <w:r>
+              <w:rPr>
+                <w:sz w:val="20"/>
+              </w:rPr>
+              <w:t>EARLY_TRAIL armed @ +10%</w:t>
+            </w:r>
+          </w:p>
+        </w:tc>
+        <w:tc>
+          <w:tcPr>
+            <w:tcW w:type="dxa" w:w="1417"/>
+          </w:tcPr>
+          <w:p>
+            <w:r>
+              <w:rPr>
+                <w:sz w:val="20"/>
+              </w:rPr>
+              <w:t>₹550.00</w:t>
+            </w:r>
+          </w:p>
+        </w:tc>
+        <w:tc>
+          <w:tcPr>
+            <w:tcW w:type="dxa" w:w="1134"/>
+          </w:tcPr>
+          <w:p>
+            <w:r>
+              <w:rPr>
+                <w:sz w:val="20"/>
+              </w:rPr>
+              <w:t>—</w:t>
+            </w:r>
+          </w:p>
+        </w:tc>
+        <w:tc>
+          <w:tcPr>
+            <w:tcW w:type="dxa" w:w="1701"/>
+          </w:tcPr>
+          <w:p>
+            <w:r>
+              <w:rPr>
+                <w:sz w:val="20"/>
+              </w:rPr>
+              <w:t>(no booking)</w:t>
+            </w:r>
+          </w:p>
+        </w:tc>
+        <w:tc>
+          <w:tcPr>
+            <w:tcW w:type="dxa" w:w="1984"/>
+          </w:tcPr>
+          <w:p>
+            <w:r>
+              <w:rPr>
+                <w:sz w:val="20"/>
+              </w:rPr>
+              <w:t>₹0</w:t>
             </w:r>
           </w:p>
         </w:tc>
@@ -1149,7 +1364,7 @@
           <w:b w:val="0"/>
           <w:i w:val="0"/>
         </w:rPr>
-        <w:t>Hits +3R, 1st partial fires, BE stop catches the pullback.</w:t>
+        <w:t>Hits +3R (₹590.00), 1st partial fires (33% booked, breakeven armed). Trail also armed early at +10% on the way up, so stop is already trailing. Price reverses, trailing stop catches around breakeven on the remaining qty.</w:t>
       </w:r>
     </w:p>
     <w:tbl>
@@ -1247,7 +1462,7 @@
               <w:rPr>
                 <w:sz w:val="20"/>
               </w:rPr>
-              <w:t>1st partial at +3R</w:t>
+              <w:t>EARLY_TRAIL armed @ +10%</w:t>
             </w:r>
           </w:p>
         </w:tc>
@@ -1260,7 +1475,7 @@
               <w:rPr>
                 <w:sz w:val="20"/>
               </w:rPr>
-              <w:t>₹590.00</w:t>
+              <w:t>₹550.00</w:t>
             </w:r>
           </w:p>
         </w:tc>
@@ -1273,7 +1488,7 @@
               <w:rPr>
                 <w:sz w:val="20"/>
               </w:rPr>
-              <w:t>198</w:t>
+              <w:t>—</w:t>
             </w:r>
           </w:p>
         </w:tc>
@@ -1286,7 +1501,7 @@
               <w:rPr>
                 <w:sz w:val="20"/>
               </w:rPr>
-              <w:t>₹17,820</w:t>
+              <w:t>(no booking)</w:t>
             </w:r>
           </w:p>
         </w:tc>
@@ -1299,7 +1514,7 @@
               <w:rPr>
                 <w:sz w:val="20"/>
               </w:rPr>
-              <w:t>₹17,820</w:t>
+              <w:t>₹0</w:t>
             </w:r>
           </w:p>
         </w:tc>
@@ -1314,7 +1529,74 @@
               <w:rPr>
                 <w:sz w:val="20"/>
               </w:rPr>
-              <w:t>Breakeven stop</w:t>
+              <w:t>1st partial at +3R</w:t>
+            </w:r>
+          </w:p>
+        </w:tc>
+        <w:tc>
+          <w:tcPr>
+            <w:tcW w:type="dxa" w:w="1417"/>
+          </w:tcPr>
+          <w:p>
+            <w:r>
+              <w:rPr>
+                <w:sz w:val="20"/>
+              </w:rPr>
+              <w:t>₹590.00</w:t>
+            </w:r>
+          </w:p>
+        </w:tc>
+        <w:tc>
+          <w:tcPr>
+            <w:tcW w:type="dxa" w:w="1134"/>
+          </w:tcPr>
+          <w:p>
+            <w:r>
+              <w:rPr>
+                <w:sz w:val="20"/>
+              </w:rPr>
+              <w:t>198</w:t>
+            </w:r>
+          </w:p>
+        </w:tc>
+        <w:tc>
+          <w:tcPr>
+            <w:tcW w:type="dxa" w:w="1701"/>
+          </w:tcPr>
+          <w:p>
+            <w:r>
+              <w:rPr>
+                <w:sz w:val="20"/>
+              </w:rPr>
+              <w:t>₹17,820</w:t>
+            </w:r>
+          </w:p>
+        </w:tc>
+        <w:tc>
+          <w:tcPr>
+            <w:tcW w:type="dxa" w:w="1984"/>
+          </w:tcPr>
+          <w:p>
+            <w:r>
+              <w:rPr>
+                <w:sz w:val="20"/>
+              </w:rPr>
+              <w:t>₹17,820</w:t>
+            </w:r>
+          </w:p>
+        </w:tc>
+      </w:tr>
+      <w:tr>
+        <w:tc>
+          <w:tcPr>
+            <w:tcW w:type="dxa" w:w="3402"/>
+          </w:tcPr>
+          <w:p>
+            <w:r>
+              <w:rPr>
+                <w:sz w:val="20"/>
+              </w:rPr>
+              <w:t>Trail stop catches BE</w:t>
             </w:r>
           </w:p>
         </w:tc>
@@ -1392,6 +1674,15 @@
         <w:t>Scenario C — Stopped cold (worst case)</w:t>
       </w:r>
     </w:p>
+    <w:p>
+      <w:r>
+        <w:rPr>
+          <w:b w:val="0"/>
+          <w:i w:val="0"/>
+        </w:rPr>
+        <w:t>Price drops straight to the initial stop. Never reaches +10%, so EARLY_TRAIL never fires.</w:t>
+      </w:r>
+    </w:p>
     <w:tbl>
       <w:tblPr>
         <w:tblStyle w:val="LightGrid-Accent1"/>
@@ -1562,7 +1853,7 @@
         <w:pStyle w:val="Heading2"/>
       </w:pPr>
       <w:r>
-        <w:t>Scenario D — Vertical pop (universal 25%)</w:t>
+        <w:t>Scenario D — Vertical pop (universal 25% rule)</w:t>
       </w:r>
     </w:p>
     <w:p>
@@ -1571,7 +1862,7 @@
           <w:b w:val="0"/>
           <w:i w:val="0"/>
         </w:rPr>
-        <w:t>+25% within 15td → universal book 25% of initial qty; arms breakeven. Trade then runs to +6R and trails out at +9R.</w:t>
+        <w:t>Price gains +25% (to ₹625) within 15 td. EARLY_TRAIL fires at +10% on the way up. Universal book takes 25% of initial qty at ₹625. Trade continues to +R2 (₹680.00) and trails out at +9R (₹770).</w:t>
       </w:r>
     </w:p>
     <w:tbl>
@@ -1655,6 +1946,73 @@
                 <w:sz w:val="20"/>
               </w:rPr>
               <w:t>Cumulative P&amp;L</w:t>
+            </w:r>
+          </w:p>
+        </w:tc>
+      </w:tr>
+      <w:tr>
+        <w:tc>
+          <w:tcPr>
+            <w:tcW w:type="dxa" w:w="3402"/>
+          </w:tcPr>
+          <w:p>
+            <w:r>
+              <w:rPr>
+                <w:sz w:val="20"/>
+              </w:rPr>
+              <w:t>EARLY_TRAIL armed @ +10%</w:t>
+            </w:r>
+          </w:p>
+        </w:tc>
+        <w:tc>
+          <w:tcPr>
+            <w:tcW w:type="dxa" w:w="1417"/>
+          </w:tcPr>
+          <w:p>
+            <w:r>
+              <w:rPr>
+                <w:sz w:val="20"/>
+              </w:rPr>
+              <w:t>₹550.00</w:t>
+            </w:r>
+          </w:p>
+        </w:tc>
+        <w:tc>
+          <w:tcPr>
+            <w:tcW w:type="dxa" w:w="1134"/>
+          </w:tcPr>
+          <w:p>
+            <w:r>
+              <w:rPr>
+                <w:sz w:val="20"/>
+              </w:rPr>
+              <w:t>—</w:t>
+            </w:r>
+          </w:p>
+        </w:tc>
+        <w:tc>
+          <w:tcPr>
+            <w:tcW w:type="dxa" w:w="1701"/>
+          </w:tcPr>
+          <w:p>
+            <w:r>
+              <w:rPr>
+                <w:sz w:val="20"/>
+              </w:rPr>
+              <w:t>(no booking)</w:t>
+            </w:r>
+          </w:p>
+        </w:tc>
+        <w:tc>
+          <w:tcPr>
+            <w:tcW w:type="dxa" w:w="1984"/>
+          </w:tcPr>
+          <w:p>
+            <w:r>
+              <w:rPr>
+                <w:sz w:val="20"/>
+              </w:rPr>
+              <w:t>₹0</w:t>
             </w:r>
           </w:p>
         </w:tc>
@@ -1954,7 +2312,7 @@
           <w:b w:val="0"/>
           <w:i w:val="0"/>
         </w:rPr>
-        <w:t>25td later, price = ₹505 (inside [₹490, ₹510]). Time stop closes everything.</w:t>
+        <w:t>25 td later, price = ₹505 (inside [₹490, ₹510]). Never hit +10% high during the window, so EARLY_TRAIL never fired. Time stop closes everything at close.</w:t>
       </w:r>
     </w:p>
     <w:tbl>
@@ -2120,6 +2478,322 @@
           <w:color w:val="1E40AF"/>
         </w:rPr>
         <w:t>Scenario E total: ₹3,000  (+0.17R)</w:t>
+      </w:r>
+    </w:p>
+    <w:p>
+      <w:pPr>
+        <w:pStyle w:val="Heading2"/>
+      </w:pPr>
+      <w:r>
+        <w:t>Scenario F — Early-trail save (NEW)</w:t>
+      </w:r>
+    </w:p>
+    <w:p>
+      <w:r>
+        <w:rPr>
+          <w:b w:val="0"/>
+          <w:i w:val="0"/>
+        </w:rPr>
+        <w:t>Price pops to bar-high ₹555 (+11% MFE), closes at ₹550 (+10%). EARLY_TRAIL arms: stop floors at entry, trail update sets new stop = 550 − 30 = ₹520 (+4%). Next session price gaps down and trips ₹520 intraday. Railway closes the trade at LTP ₹520. WITHOUT the EARLY_TRAIL rule, this trade would have round-tripped past entry all the way to initial stop ₹470 = −1R.</w:t>
+      </w:r>
+    </w:p>
+    <w:tbl>
+      <w:tblPr>
+        <w:tblStyle w:val="LightGrid-Accent1"/>
+        <w:tblW w:type="auto" w:w="0"/>
+        <w:tblLook w:firstColumn="1" w:firstRow="1" w:lastColumn="0" w:lastRow="0" w:noHBand="0" w:noVBand="1" w:val="04A0"/>
+      </w:tblPr>
+      <w:tblGrid>
+        <w:gridCol w:w="1994"/>
+        <w:gridCol w:w="1994"/>
+        <w:gridCol w:w="1994"/>
+        <w:gridCol w:w="1994"/>
+        <w:gridCol w:w="1994"/>
+      </w:tblGrid>
+      <w:tr>
+        <w:tc>
+          <w:tcPr>
+            <w:tcW w:type="dxa" w:w="3402"/>
+          </w:tcPr>
+          <w:p>
+            <w:r>
+              <w:rPr>
+                <w:b/>
+                <w:sz w:val="20"/>
+              </w:rPr>
+              <w:t>Milestone</w:t>
+            </w:r>
+          </w:p>
+        </w:tc>
+        <w:tc>
+          <w:tcPr>
+            <w:tcW w:type="dxa" w:w="1417"/>
+          </w:tcPr>
+          <w:p>
+            <w:r>
+              <w:rPr>
+                <w:b/>
+                <w:sz w:val="20"/>
+              </w:rPr>
+              <w:t>Price</w:t>
+            </w:r>
+          </w:p>
+        </w:tc>
+        <w:tc>
+          <w:tcPr>
+            <w:tcW w:type="dxa" w:w="1134"/>
+          </w:tcPr>
+          <w:p>
+            <w:r>
+              <w:rPr>
+                <w:b/>
+                <w:sz w:val="20"/>
+              </w:rPr>
+              <w:t>Qty</w:t>
+            </w:r>
+          </w:p>
+        </w:tc>
+        <w:tc>
+          <w:tcPr>
+            <w:tcW w:type="dxa" w:w="1701"/>
+          </w:tcPr>
+          <w:p>
+            <w:r>
+              <w:rPr>
+                <w:b/>
+                <w:sz w:val="20"/>
+              </w:rPr>
+              <w:t>P&amp;L</w:t>
+            </w:r>
+          </w:p>
+        </w:tc>
+        <w:tc>
+          <w:tcPr>
+            <w:tcW w:type="dxa" w:w="1984"/>
+          </w:tcPr>
+          <w:p>
+            <w:r>
+              <w:rPr>
+                <w:b/>
+                <w:sz w:val="20"/>
+              </w:rPr>
+              <w:t>Cumulative P&amp;L</w:t>
+            </w:r>
+          </w:p>
+        </w:tc>
+      </w:tr>
+      <w:tr>
+        <w:tc>
+          <w:tcPr>
+            <w:tcW w:type="dxa" w:w="3402"/>
+          </w:tcPr>
+          <w:p>
+            <w:r>
+              <w:rPr>
+                <w:sz w:val="20"/>
+              </w:rPr>
+              <w:t>MFE hits +11%; EARLY_TRAIL armed</w:t>
+            </w:r>
+          </w:p>
+        </w:tc>
+        <w:tc>
+          <w:tcPr>
+            <w:tcW w:type="dxa" w:w="1417"/>
+          </w:tcPr>
+          <w:p>
+            <w:r>
+              <w:rPr>
+                <w:sz w:val="20"/>
+              </w:rPr>
+              <w:t>₹555.00 high</w:t>
+            </w:r>
+          </w:p>
+        </w:tc>
+        <w:tc>
+          <w:tcPr>
+            <w:tcW w:type="dxa" w:w="1134"/>
+          </w:tcPr>
+          <w:p>
+            <w:r>
+              <w:rPr>
+                <w:sz w:val="20"/>
+              </w:rPr>
+              <w:t>—</w:t>
+            </w:r>
+          </w:p>
+        </w:tc>
+        <w:tc>
+          <w:tcPr>
+            <w:tcW w:type="dxa" w:w="1701"/>
+          </w:tcPr>
+          <w:p>
+            <w:r>
+              <w:rPr>
+                <w:sz w:val="20"/>
+              </w:rPr>
+              <w:t>(no booking)</w:t>
+            </w:r>
+          </w:p>
+        </w:tc>
+        <w:tc>
+          <w:tcPr>
+            <w:tcW w:type="dxa" w:w="1984"/>
+          </w:tcPr>
+          <w:p>
+            <w:r>
+              <w:rPr>
+                <w:sz w:val="20"/>
+              </w:rPr>
+              <w:t>₹0</w:t>
+            </w:r>
+          </w:p>
+        </w:tc>
+      </w:tr>
+      <w:tr>
+        <w:tc>
+          <w:tcPr>
+            <w:tcW w:type="dxa" w:w="3402"/>
+          </w:tcPr>
+          <w:p>
+            <w:r>
+              <w:rPr>
+                <w:sz w:val="20"/>
+              </w:rPr>
+              <w:t>Trail stop set at close − 2×ATR</w:t>
+            </w:r>
+          </w:p>
+        </w:tc>
+        <w:tc>
+          <w:tcPr>
+            <w:tcW w:type="dxa" w:w="1417"/>
+          </w:tcPr>
+          <w:p>
+            <w:r>
+              <w:rPr>
+                <w:sz w:val="20"/>
+              </w:rPr>
+              <w:t>stop = ₹520</w:t>
+            </w:r>
+          </w:p>
+        </w:tc>
+        <w:tc>
+          <w:tcPr>
+            <w:tcW w:type="dxa" w:w="1134"/>
+          </w:tcPr>
+          <w:p>
+            <w:r>
+              <w:rPr>
+                <w:sz w:val="20"/>
+              </w:rPr>
+              <w:t>—</w:t>
+            </w:r>
+          </w:p>
+        </w:tc>
+        <w:tc>
+          <w:tcPr>
+            <w:tcW w:type="dxa" w:w="1701"/>
+          </w:tcPr>
+          <w:p>
+            <w:r>
+              <w:rPr>
+                <w:sz w:val="20"/>
+              </w:rPr>
+              <w:t>—</w:t>
+            </w:r>
+          </w:p>
+        </w:tc>
+        <w:tc>
+          <w:tcPr>
+            <w:tcW w:type="dxa" w:w="1984"/>
+          </w:tcPr>
+          <w:p>
+            <w:r>
+              <w:rPr>
+                <w:sz w:val="20"/>
+              </w:rPr>
+              <w:t>—</w:t>
+            </w:r>
+          </w:p>
+        </w:tc>
+      </w:tr>
+      <w:tr>
+        <w:tc>
+          <w:tcPr>
+            <w:tcW w:type="dxa" w:w="3402"/>
+          </w:tcPr>
+          <w:p>
+            <w:r>
+              <w:rPr>
+                <w:sz w:val="20"/>
+              </w:rPr>
+              <w:t>Next session: trail stop hits</w:t>
+            </w:r>
+          </w:p>
+        </w:tc>
+        <w:tc>
+          <w:tcPr>
+            <w:tcW w:type="dxa" w:w="1417"/>
+          </w:tcPr>
+          <w:p>
+            <w:r>
+              <w:rPr>
+                <w:sz w:val="20"/>
+              </w:rPr>
+              <w:t>₹520.00</w:t>
+            </w:r>
+          </w:p>
+        </w:tc>
+        <w:tc>
+          <w:tcPr>
+            <w:tcW w:type="dxa" w:w="1134"/>
+          </w:tcPr>
+          <w:p>
+            <w:r>
+              <w:rPr>
+                <w:sz w:val="20"/>
+              </w:rPr>
+              <w:t>600</w:t>
+            </w:r>
+          </w:p>
+        </w:tc>
+        <w:tc>
+          <w:tcPr>
+            <w:tcW w:type="dxa" w:w="1701"/>
+          </w:tcPr>
+          <w:p>
+            <w:r>
+              <w:rPr>
+                <w:sz w:val="20"/>
+              </w:rPr>
+              <w:t>₹12,000</w:t>
+            </w:r>
+          </w:p>
+        </w:tc>
+        <w:tc>
+          <w:tcPr>
+            <w:tcW w:type="dxa" w:w="1984"/>
+          </w:tcPr>
+          <w:p>
+            <w:r>
+              <w:rPr>
+                <w:sz w:val="20"/>
+              </w:rPr>
+              <w:t>₹12,000</w:t>
+            </w:r>
+          </w:p>
+        </w:tc>
+      </w:tr>
+    </w:tbl>
+    <w:p>
+      <w:pPr>
+        <w:ind w:left="170"/>
+      </w:pPr>
+      <w:r>
+        <w:rPr>
+          <w:b/>
+          <w:color w:val="1E40AF"/>
+        </w:rPr>
+        <w:t>Scenario F total: ₹12,000  (+0.67R)  |  Without EARLY_TRAIL: ₹-18,000 (−1.00R)  |  Difference: ₹30,000 (+1.67R)</w:t>
       </w:r>
     </w:p>
     <w:p>
@@ -2466,6 +3140,60 @@
                 <w:sz w:val="20"/>
               </w:rPr>
               <w:t>+0.12%</w:t>
+            </w:r>
+          </w:p>
+        </w:tc>
+      </w:tr>
+      <w:tr>
+        <w:tc>
+          <w:tcPr>
+            <w:tcW w:type="dxa" w:w="3402"/>
+          </w:tcPr>
+          <w:p>
+            <w:r>
+              <w:rPr>
+                <w:sz w:val="20"/>
+              </w:rPr>
+              <w:t>F — Early-trail save</w:t>
+            </w:r>
+          </w:p>
+        </w:tc>
+        <w:tc>
+          <w:tcPr>
+            <w:tcW w:type="dxa" w:w="1984"/>
+          </w:tcPr>
+          <w:p>
+            <w:r>
+              <w:rPr>
+                <w:sz w:val="20"/>
+              </w:rPr>
+              <w:t>₹12,000</w:t>
+            </w:r>
+          </w:p>
+        </w:tc>
+        <w:tc>
+          <w:tcPr>
+            <w:tcW w:type="dxa" w:w="1701"/>
+          </w:tcPr>
+          <w:p>
+            <w:r>
+              <w:rPr>
+                <w:sz w:val="20"/>
+              </w:rPr>
+              <w:t>+0.67R</w:t>
+            </w:r>
+          </w:p>
+        </w:tc>
+        <w:tc>
+          <w:tcPr>
+            <w:tcW w:type="dxa" w:w="1701"/>
+          </w:tcPr>
+          <w:p>
+            <w:r>
+              <w:rPr>
+                <w:sz w:val="20"/>
+              </w:rPr>
+              <w:t>+0.48%</w:t>
             </w:r>
           </w:p>
         </w:tc>
@@ -2510,20 +3238,11 @@
       </w:r>
     </w:p>
     <w:p>
-      <w:r>
-        <w:rPr>
-          <w:b w:val="0"/>
-          <w:i/>
-        </w:rPr>
-        <w:t>Cap binds → actual risk ₹15,000 (0.60%) is below the 1.00% target. Expected for low-ATR names — by design.</w:t>
-      </w:r>
-    </w:p>
-    <w:p>
       <w:pPr>
         <w:pStyle w:val="Heading2"/>
       </w:pPr>
       <w:r>
-        <w:t>Stop loss &amp; R-multiple ladder</w:t>
+        <w:t>Stop, R ladder, and early-trail trigger</w:t>
       </w:r>
     </w:p>
     <w:p>
@@ -2535,19 +3254,30 @@
           <w:rFonts w:ascii="Consolas" w:hAnsi="Consolas"/>
           <w:sz w:val="19"/>
         </w:rPr>
-        <w:t>initial_stop  = ₹500 − (2 × ₹15)  = ₹470.00</w:t>
+        <w:t>initial_stop  = ₹500 − (2 × ₹15)  = ₹470.00   (−6% / −1R)</w:t>
         <w:br/>
-        <w:t>R             = ₹500 − ₹470       = ₹30 per share</w:t>
+        <w:t>R             = ₹500 − ₹470       = ₹30 per share  (1R = 6.0% of entry)</w:t>
         <w:br/>
         <w:br/>
-        <w:t>1st partial:  +2R  → ₹500 + (2 × ₹30) = ₹560.00</w:t>
+        <w:t>1st partial:   +2R = ₹560.00  (+12.0%)</w:t>
         <w:br/>
-        <w:t>2nd partial:  +4R  → ₹500 + (4 × ₹30) = ₹620.00</w:t>
+        <w:t>2nd partial:   +4R = ₹620.00  (+24.0%)</w:t>
+        <w:br/>
+        <w:t>EARLY_TRAIL:   +10% = ₹550.00    ← fires BEFORE the 1st R-partial</w:t>
         <w:br/>
         <w:br/>
-        <w:t>partial_qty   = floor(500 × 33%) = 165 shares</w:t>
+        <w:t>partial_qty   = floor(500 × 33%) = 165 shares per R-partial</w:t>
         <w:br/>
         <w:t>residual_qty  = 500 − 2 × 165 = 170 shares (trails)</w:t>
+      </w:r>
+    </w:p>
+    <w:p>
+      <w:r>
+        <w:rPr>
+          <w:b w:val="0"/>
+          <w:i/>
+        </w:rPr>
+        <w:t>Because 1st formal partial sits at +12.0% (above +10%), the EARLY_TRAIL rule will fire FIRST on any trade that crosses +10%. The trail arms and the stop floors at entry well before the formal partial target.</w:t>
       </w:r>
     </w:p>
     <w:p>
@@ -2564,7 +3294,7 @@
           <w:b w:val="0"/>
           <w:i w:val="0"/>
         </w:rPr>
-        <w:t>At +2R (₹560.00) → 1st partial; stop → breakeven. At +4R (₹620.00) → 2nd partial; trail armed. Residual trails out at +9R (₹770).</w:t>
+        <w:t>Price rallies. At +10% (₹550), EARLY_TRAIL arms early — stop floors at entry, trail starts ratcheting daily. At ₹560.00 (+2R) the 1st partial fires. At ₹620.00 (+4R) the 2nd partial fires. Residual 170 shares ride the trail until it catches at ~+9R (₹770).</w:t>
       </w:r>
     </w:p>
     <w:tbl>
@@ -2648,6 +3378,73 @@
                 <w:sz w:val="20"/>
               </w:rPr>
               <w:t>Cumulative P&amp;L</w:t>
+            </w:r>
+          </w:p>
+        </w:tc>
+      </w:tr>
+      <w:tr>
+        <w:tc>
+          <w:tcPr>
+            <w:tcW w:type="dxa" w:w="3402"/>
+          </w:tcPr>
+          <w:p>
+            <w:r>
+              <w:rPr>
+                <w:sz w:val="20"/>
+              </w:rPr>
+              <w:t>EARLY_TRAIL armed @ +10%</w:t>
+            </w:r>
+          </w:p>
+        </w:tc>
+        <w:tc>
+          <w:tcPr>
+            <w:tcW w:type="dxa" w:w="1417"/>
+          </w:tcPr>
+          <w:p>
+            <w:r>
+              <w:rPr>
+                <w:sz w:val="20"/>
+              </w:rPr>
+              <w:t>₹550.00</w:t>
+            </w:r>
+          </w:p>
+        </w:tc>
+        <w:tc>
+          <w:tcPr>
+            <w:tcW w:type="dxa" w:w="1134"/>
+          </w:tcPr>
+          <w:p>
+            <w:r>
+              <w:rPr>
+                <w:sz w:val="20"/>
+              </w:rPr>
+              <w:t>—</w:t>
+            </w:r>
+          </w:p>
+        </w:tc>
+        <w:tc>
+          <w:tcPr>
+            <w:tcW w:type="dxa" w:w="1701"/>
+          </w:tcPr>
+          <w:p>
+            <w:r>
+              <w:rPr>
+                <w:sz w:val="20"/>
+              </w:rPr>
+              <w:t>(no booking)</w:t>
+            </w:r>
+          </w:p>
+        </w:tc>
+        <w:tc>
+          <w:tcPr>
+            <w:tcW w:type="dxa" w:w="1984"/>
+          </w:tcPr>
+          <w:p>
+            <w:r>
+              <w:rPr>
+                <w:sz w:val="20"/>
+              </w:rPr>
+              <w:t>₹0</w:t>
             </w:r>
           </w:p>
         </w:tc>
@@ -2880,7 +3677,7 @@
           <w:b w:val="0"/>
           <w:i w:val="0"/>
         </w:rPr>
-        <w:t>Hits +2R, 1st partial fires, BE stop catches the pullback.</w:t>
+        <w:t>Hits +2R (₹560.00), 1st partial fires (33% booked, breakeven armed). Trail also armed early at +10% on the way up, so stop is already trailing. Price reverses, trailing stop catches around breakeven on the remaining qty.</w:t>
       </w:r>
     </w:p>
     <w:tbl>
@@ -2978,7 +3775,7 @@
               <w:rPr>
                 <w:sz w:val="20"/>
               </w:rPr>
-              <w:t>1st partial at +2R</w:t>
+              <w:t>EARLY_TRAIL armed @ +10%</w:t>
             </w:r>
           </w:p>
         </w:tc>
@@ -2991,7 +3788,7 @@
               <w:rPr>
                 <w:sz w:val="20"/>
               </w:rPr>
-              <w:t>₹560.00</w:t>
+              <w:t>₹550.00</w:t>
             </w:r>
           </w:p>
         </w:tc>
@@ -3004,7 +3801,7 @@
               <w:rPr>
                 <w:sz w:val="20"/>
               </w:rPr>
-              <w:t>165</w:t>
+              <w:t>—</w:t>
             </w:r>
           </w:p>
         </w:tc>
@@ -3017,7 +3814,7 @@
               <w:rPr>
                 <w:sz w:val="20"/>
               </w:rPr>
-              <w:t>₹9,900</w:t>
+              <w:t>(no booking)</w:t>
             </w:r>
           </w:p>
         </w:tc>
@@ -3030,7 +3827,7 @@
               <w:rPr>
                 <w:sz w:val="20"/>
               </w:rPr>
-              <w:t>₹9,900</w:t>
+              <w:t>₹0</w:t>
             </w:r>
           </w:p>
         </w:tc>
@@ -3045,7 +3842,74 @@
               <w:rPr>
                 <w:sz w:val="20"/>
               </w:rPr>
-              <w:t>Breakeven stop</w:t>
+              <w:t>1st partial at +2R</w:t>
+            </w:r>
+          </w:p>
+        </w:tc>
+        <w:tc>
+          <w:tcPr>
+            <w:tcW w:type="dxa" w:w="1417"/>
+          </w:tcPr>
+          <w:p>
+            <w:r>
+              <w:rPr>
+                <w:sz w:val="20"/>
+              </w:rPr>
+              <w:t>₹560.00</w:t>
+            </w:r>
+          </w:p>
+        </w:tc>
+        <w:tc>
+          <w:tcPr>
+            <w:tcW w:type="dxa" w:w="1134"/>
+          </w:tcPr>
+          <w:p>
+            <w:r>
+              <w:rPr>
+                <w:sz w:val="20"/>
+              </w:rPr>
+              <w:t>165</w:t>
+            </w:r>
+          </w:p>
+        </w:tc>
+        <w:tc>
+          <w:tcPr>
+            <w:tcW w:type="dxa" w:w="1701"/>
+          </w:tcPr>
+          <w:p>
+            <w:r>
+              <w:rPr>
+                <w:sz w:val="20"/>
+              </w:rPr>
+              <w:t>₹9,900</w:t>
+            </w:r>
+          </w:p>
+        </w:tc>
+        <w:tc>
+          <w:tcPr>
+            <w:tcW w:type="dxa" w:w="1984"/>
+          </w:tcPr>
+          <w:p>
+            <w:r>
+              <w:rPr>
+                <w:sz w:val="20"/>
+              </w:rPr>
+              <w:t>₹9,900</w:t>
+            </w:r>
+          </w:p>
+        </w:tc>
+      </w:tr>
+      <w:tr>
+        <w:tc>
+          <w:tcPr>
+            <w:tcW w:type="dxa" w:w="3402"/>
+          </w:tcPr>
+          <w:p>
+            <w:r>
+              <w:rPr>
+                <w:sz w:val="20"/>
+              </w:rPr>
+              <w:t>Trail stop catches BE</w:t>
             </w:r>
           </w:p>
         </w:tc>
@@ -3123,6 +3987,15 @@
         <w:t>Scenario C — Stopped cold (worst case)</w:t>
       </w:r>
     </w:p>
+    <w:p>
+      <w:r>
+        <w:rPr>
+          <w:b w:val="0"/>
+          <w:i w:val="0"/>
+        </w:rPr>
+        <w:t>Price drops straight to the initial stop. Never reaches +10%, so EARLY_TRAIL never fires.</w:t>
+      </w:r>
+    </w:p>
     <w:tbl>
       <w:tblPr>
         <w:tblStyle w:val="LightGrid-Accent1"/>
@@ -3293,7 +4166,7 @@
         <w:pStyle w:val="Heading2"/>
       </w:pPr>
       <w:r>
-        <w:t>Scenario D — Vertical pop (universal 25%)</w:t>
+        <w:t>Scenario D — Vertical pop (universal 25% rule)</w:t>
       </w:r>
     </w:p>
     <w:p>
@@ -3302,7 +4175,7 @@
           <w:b w:val="0"/>
           <w:i w:val="0"/>
         </w:rPr>
-        <w:t>+25% within 15td → universal book 25% of initial qty; arms breakeven. Trade then runs to +4R and trails out at +9R.</w:t>
+        <w:t>Price gains +25% (to ₹625) within 15 td. EARLY_TRAIL fires at +10% on the way up. Universal book takes 25% of initial qty at ₹625. Trade continues to +R2 (₹620.00) and trails out at +9R (₹770).</w:t>
       </w:r>
     </w:p>
     <w:tbl>
@@ -3386,6 +4259,73 @@
                 <w:sz w:val="20"/>
               </w:rPr>
               <w:t>Cumulative P&amp;L</w:t>
+            </w:r>
+          </w:p>
+        </w:tc>
+      </w:tr>
+      <w:tr>
+        <w:tc>
+          <w:tcPr>
+            <w:tcW w:type="dxa" w:w="3402"/>
+          </w:tcPr>
+          <w:p>
+            <w:r>
+              <w:rPr>
+                <w:sz w:val="20"/>
+              </w:rPr>
+              <w:t>EARLY_TRAIL armed @ +10%</w:t>
+            </w:r>
+          </w:p>
+        </w:tc>
+        <w:tc>
+          <w:tcPr>
+            <w:tcW w:type="dxa" w:w="1417"/>
+          </w:tcPr>
+          <w:p>
+            <w:r>
+              <w:rPr>
+                <w:sz w:val="20"/>
+              </w:rPr>
+              <w:t>₹550.00</w:t>
+            </w:r>
+          </w:p>
+        </w:tc>
+        <w:tc>
+          <w:tcPr>
+            <w:tcW w:type="dxa" w:w="1134"/>
+          </w:tcPr>
+          <w:p>
+            <w:r>
+              <w:rPr>
+                <w:sz w:val="20"/>
+              </w:rPr>
+              <w:t>—</w:t>
+            </w:r>
+          </w:p>
+        </w:tc>
+        <w:tc>
+          <w:tcPr>
+            <w:tcW w:type="dxa" w:w="1701"/>
+          </w:tcPr>
+          <w:p>
+            <w:r>
+              <w:rPr>
+                <w:sz w:val="20"/>
+              </w:rPr>
+              <w:t>(no booking)</w:t>
+            </w:r>
+          </w:p>
+        </w:tc>
+        <w:tc>
+          <w:tcPr>
+            <w:tcW w:type="dxa" w:w="1984"/>
+          </w:tcPr>
+          <w:p>
+            <w:r>
+              <w:rPr>
+                <w:sz w:val="20"/>
+              </w:rPr>
+              <w:t>₹0</w:t>
             </w:r>
           </w:p>
         </w:tc>
@@ -3685,7 +4625,7 @@
           <w:b w:val="0"/>
           <w:i w:val="0"/>
         </w:rPr>
-        <w:t>25td later, price = ₹505 (inside [₹490, ₹510]). Time stop closes everything.</w:t>
+        <w:t>25 td later, price = ₹505 (inside [₹490, ₹510]). Never hit +10% high during the window, so EARLY_TRAIL never fired. Time stop closes everything at close.</w:t>
       </w:r>
     </w:p>
     <w:tbl>
@@ -3851,6 +4791,322 @@
           <w:color w:val="1E40AF"/>
         </w:rPr>
         <w:t>Scenario E total: ₹2,500  (+0.17R)</w:t>
+      </w:r>
+    </w:p>
+    <w:p>
+      <w:pPr>
+        <w:pStyle w:val="Heading2"/>
+      </w:pPr>
+      <w:r>
+        <w:t>Scenario F — Early-trail save (NEW)</w:t>
+      </w:r>
+    </w:p>
+    <w:p>
+      <w:r>
+        <w:rPr>
+          <w:b w:val="0"/>
+          <w:i w:val="0"/>
+        </w:rPr>
+        <w:t>Price pops to bar-high ₹555 (+11% MFE), closes at ₹550 (+10%). EARLY_TRAIL arms: stop floors at entry, trail update sets new stop = 550 − 30 = ₹520 (+4%). Next session price gaps down and trips ₹520 intraday. Railway closes the trade at LTP ₹520. WITHOUT the EARLY_TRAIL rule, this trade would have round-tripped past entry all the way to initial stop ₹470 = −1R.</w:t>
+      </w:r>
+    </w:p>
+    <w:tbl>
+      <w:tblPr>
+        <w:tblStyle w:val="LightGrid-Accent1"/>
+        <w:tblW w:type="auto" w:w="0"/>
+        <w:tblLook w:firstColumn="1" w:firstRow="1" w:lastColumn="0" w:lastRow="0" w:noHBand="0" w:noVBand="1" w:val="04A0"/>
+      </w:tblPr>
+      <w:tblGrid>
+        <w:gridCol w:w="1994"/>
+        <w:gridCol w:w="1994"/>
+        <w:gridCol w:w="1994"/>
+        <w:gridCol w:w="1994"/>
+        <w:gridCol w:w="1994"/>
+      </w:tblGrid>
+      <w:tr>
+        <w:tc>
+          <w:tcPr>
+            <w:tcW w:type="dxa" w:w="3402"/>
+          </w:tcPr>
+          <w:p>
+            <w:r>
+              <w:rPr>
+                <w:b/>
+                <w:sz w:val="20"/>
+              </w:rPr>
+              <w:t>Milestone</w:t>
+            </w:r>
+          </w:p>
+        </w:tc>
+        <w:tc>
+          <w:tcPr>
+            <w:tcW w:type="dxa" w:w="1417"/>
+          </w:tcPr>
+          <w:p>
+            <w:r>
+              <w:rPr>
+                <w:b/>
+                <w:sz w:val="20"/>
+              </w:rPr>
+              <w:t>Price</w:t>
+            </w:r>
+          </w:p>
+        </w:tc>
+        <w:tc>
+          <w:tcPr>
+            <w:tcW w:type="dxa" w:w="1134"/>
+          </w:tcPr>
+          <w:p>
+            <w:r>
+              <w:rPr>
+                <w:b/>
+                <w:sz w:val="20"/>
+              </w:rPr>
+              <w:t>Qty</w:t>
+            </w:r>
+          </w:p>
+        </w:tc>
+        <w:tc>
+          <w:tcPr>
+            <w:tcW w:type="dxa" w:w="1701"/>
+          </w:tcPr>
+          <w:p>
+            <w:r>
+              <w:rPr>
+                <w:b/>
+                <w:sz w:val="20"/>
+              </w:rPr>
+              <w:t>P&amp;L</w:t>
+            </w:r>
+          </w:p>
+        </w:tc>
+        <w:tc>
+          <w:tcPr>
+            <w:tcW w:type="dxa" w:w="1984"/>
+          </w:tcPr>
+          <w:p>
+            <w:r>
+              <w:rPr>
+                <w:b/>
+                <w:sz w:val="20"/>
+              </w:rPr>
+              <w:t>Cumulative P&amp;L</w:t>
+            </w:r>
+          </w:p>
+        </w:tc>
+      </w:tr>
+      <w:tr>
+        <w:tc>
+          <w:tcPr>
+            <w:tcW w:type="dxa" w:w="3402"/>
+          </w:tcPr>
+          <w:p>
+            <w:r>
+              <w:rPr>
+                <w:sz w:val="20"/>
+              </w:rPr>
+              <w:t>MFE hits +11%; EARLY_TRAIL armed</w:t>
+            </w:r>
+          </w:p>
+        </w:tc>
+        <w:tc>
+          <w:tcPr>
+            <w:tcW w:type="dxa" w:w="1417"/>
+          </w:tcPr>
+          <w:p>
+            <w:r>
+              <w:rPr>
+                <w:sz w:val="20"/>
+              </w:rPr>
+              <w:t>₹555.00 high</w:t>
+            </w:r>
+          </w:p>
+        </w:tc>
+        <w:tc>
+          <w:tcPr>
+            <w:tcW w:type="dxa" w:w="1134"/>
+          </w:tcPr>
+          <w:p>
+            <w:r>
+              <w:rPr>
+                <w:sz w:val="20"/>
+              </w:rPr>
+              <w:t>—</w:t>
+            </w:r>
+          </w:p>
+        </w:tc>
+        <w:tc>
+          <w:tcPr>
+            <w:tcW w:type="dxa" w:w="1701"/>
+          </w:tcPr>
+          <w:p>
+            <w:r>
+              <w:rPr>
+                <w:sz w:val="20"/>
+              </w:rPr>
+              <w:t>(no booking)</w:t>
+            </w:r>
+          </w:p>
+        </w:tc>
+        <w:tc>
+          <w:tcPr>
+            <w:tcW w:type="dxa" w:w="1984"/>
+          </w:tcPr>
+          <w:p>
+            <w:r>
+              <w:rPr>
+                <w:sz w:val="20"/>
+              </w:rPr>
+              <w:t>₹0</w:t>
+            </w:r>
+          </w:p>
+        </w:tc>
+      </w:tr>
+      <w:tr>
+        <w:tc>
+          <w:tcPr>
+            <w:tcW w:type="dxa" w:w="3402"/>
+          </w:tcPr>
+          <w:p>
+            <w:r>
+              <w:rPr>
+                <w:sz w:val="20"/>
+              </w:rPr>
+              <w:t>Trail stop set at close − 2×ATR</w:t>
+            </w:r>
+          </w:p>
+        </w:tc>
+        <w:tc>
+          <w:tcPr>
+            <w:tcW w:type="dxa" w:w="1417"/>
+          </w:tcPr>
+          <w:p>
+            <w:r>
+              <w:rPr>
+                <w:sz w:val="20"/>
+              </w:rPr>
+              <w:t>stop = ₹520</w:t>
+            </w:r>
+          </w:p>
+        </w:tc>
+        <w:tc>
+          <w:tcPr>
+            <w:tcW w:type="dxa" w:w="1134"/>
+          </w:tcPr>
+          <w:p>
+            <w:r>
+              <w:rPr>
+                <w:sz w:val="20"/>
+              </w:rPr>
+              <w:t>—</w:t>
+            </w:r>
+          </w:p>
+        </w:tc>
+        <w:tc>
+          <w:tcPr>
+            <w:tcW w:type="dxa" w:w="1701"/>
+          </w:tcPr>
+          <w:p>
+            <w:r>
+              <w:rPr>
+                <w:sz w:val="20"/>
+              </w:rPr>
+              <w:t>—</w:t>
+            </w:r>
+          </w:p>
+        </w:tc>
+        <w:tc>
+          <w:tcPr>
+            <w:tcW w:type="dxa" w:w="1984"/>
+          </w:tcPr>
+          <w:p>
+            <w:r>
+              <w:rPr>
+                <w:sz w:val="20"/>
+              </w:rPr>
+              <w:t>—</w:t>
+            </w:r>
+          </w:p>
+        </w:tc>
+      </w:tr>
+      <w:tr>
+        <w:tc>
+          <w:tcPr>
+            <w:tcW w:type="dxa" w:w="3402"/>
+          </w:tcPr>
+          <w:p>
+            <w:r>
+              <w:rPr>
+                <w:sz w:val="20"/>
+              </w:rPr>
+              <w:t>Next session: trail stop hits</w:t>
+            </w:r>
+          </w:p>
+        </w:tc>
+        <w:tc>
+          <w:tcPr>
+            <w:tcW w:type="dxa" w:w="1417"/>
+          </w:tcPr>
+          <w:p>
+            <w:r>
+              <w:rPr>
+                <w:sz w:val="20"/>
+              </w:rPr>
+              <w:t>₹520.00</w:t>
+            </w:r>
+          </w:p>
+        </w:tc>
+        <w:tc>
+          <w:tcPr>
+            <w:tcW w:type="dxa" w:w="1134"/>
+          </w:tcPr>
+          <w:p>
+            <w:r>
+              <w:rPr>
+                <w:sz w:val="20"/>
+              </w:rPr>
+              <w:t>500</w:t>
+            </w:r>
+          </w:p>
+        </w:tc>
+        <w:tc>
+          <w:tcPr>
+            <w:tcW w:type="dxa" w:w="1701"/>
+          </w:tcPr>
+          <w:p>
+            <w:r>
+              <w:rPr>
+                <w:sz w:val="20"/>
+              </w:rPr>
+              <w:t>₹10,000</w:t>
+            </w:r>
+          </w:p>
+        </w:tc>
+        <w:tc>
+          <w:tcPr>
+            <w:tcW w:type="dxa" w:w="1984"/>
+          </w:tcPr>
+          <w:p>
+            <w:r>
+              <w:rPr>
+                <w:sz w:val="20"/>
+              </w:rPr>
+              <w:t>₹10,000</w:t>
+            </w:r>
+          </w:p>
+        </w:tc>
+      </w:tr>
+    </w:tbl>
+    <w:p>
+      <w:pPr>
+        <w:ind w:left="170"/>
+      </w:pPr>
+      <w:r>
+        <w:rPr>
+          <w:b/>
+          <w:color w:val="1E40AF"/>
+        </w:rPr>
+        <w:t>Scenario F total: ₹10,000  (+0.67R)  |  Without EARLY_TRAIL: ₹-15,000 (−1.00R)  |  Difference: ₹25,000 (+1.67R)</w:t>
       </w:r>
     </w:p>
     <w:p>
@@ -4197,6 +5453,60 @@
                 <w:sz w:val="20"/>
               </w:rPr>
               <w:t>+0.10%</w:t>
+            </w:r>
+          </w:p>
+        </w:tc>
+      </w:tr>
+      <w:tr>
+        <w:tc>
+          <w:tcPr>
+            <w:tcW w:type="dxa" w:w="3402"/>
+          </w:tcPr>
+          <w:p>
+            <w:r>
+              <w:rPr>
+                <w:sz w:val="20"/>
+              </w:rPr>
+              <w:t>F — Early-trail save</w:t>
+            </w:r>
+          </w:p>
+        </w:tc>
+        <w:tc>
+          <w:tcPr>
+            <w:tcW w:type="dxa" w:w="1984"/>
+          </w:tcPr>
+          <w:p>
+            <w:r>
+              <w:rPr>
+                <w:sz w:val="20"/>
+              </w:rPr>
+              <w:t>₹10,000</w:t>
+            </w:r>
+          </w:p>
+        </w:tc>
+        <w:tc>
+          <w:tcPr>
+            <w:tcW w:type="dxa" w:w="1701"/>
+          </w:tcPr>
+          <w:p>
+            <w:r>
+              <w:rPr>
+                <w:sz w:val="20"/>
+              </w:rPr>
+              <w:t>+0.67R</w:t>
+            </w:r>
+          </w:p>
+        </w:tc>
+        <w:tc>
+          <w:tcPr>
+            <w:tcW w:type="dxa" w:w="1701"/>
+          </w:tcPr>
+          <w:p>
+            <w:r>
+              <w:rPr>
+                <w:sz w:val="20"/>
+              </w:rPr>
+              <w:t>+0.40%</w:t>
             </w:r>
           </w:p>
         </w:tc>
@@ -4241,20 +5551,11 @@
       </w:r>
     </w:p>
     <w:p>
-      <w:r>
-        <w:rPr>
-          <w:b w:val="0"/>
-          <w:i/>
-        </w:rPr>
-        <w:t>Cap binds → actual risk ₹9,000 (0.36%) is below the 0.66% target. Expected for low-ATR names — by design.</w:t>
-      </w:r>
-    </w:p>
-    <w:p>
       <w:pPr>
         <w:pStyle w:val="Heading2"/>
       </w:pPr>
       <w:r>
-        <w:t>Stop loss &amp; R-multiple ladder</w:t>
+        <w:t>Stop, R ladder, and early-trail trigger</w:t>
       </w:r>
     </w:p>
     <w:p>
@@ -4266,19 +5567,30 @@
           <w:rFonts w:ascii="Consolas" w:hAnsi="Consolas"/>
           <w:sz w:val="19"/>
         </w:rPr>
-        <w:t>initial_stop  = ₹500 − (2 × ₹15)  = ₹470.00</w:t>
+        <w:t>initial_stop  = ₹500 − (2 × ₹15)  = ₹470.00   (−6% / −1R)</w:t>
         <w:br/>
-        <w:t>R             = ₹500 − ₹470       = ₹30 per share</w:t>
+        <w:t>R             = ₹500 − ₹470       = ₹30 per share  (1R = 6.0% of entry)</w:t>
         <w:br/>
         <w:br/>
-        <w:t>1st partial:  +2R  → ₹500 + (2 × ₹30) = ₹560.00</w:t>
+        <w:t>1st partial:   +2R = ₹560.00  (+12.0%)</w:t>
         <w:br/>
-        <w:t>2nd partial:  +4R  → ₹500 + (4 × ₹30) = ₹620.00</w:t>
+        <w:t>2nd partial:   +4R = ₹620.00  (+24.0%)</w:t>
+        <w:br/>
+        <w:t>EARLY_TRAIL:   +10% = ₹550.00    ← fires BEFORE the 1st R-partial</w:t>
         <w:br/>
         <w:br/>
-        <w:t>partial_qty   = floor(300 × 33%) = 99 shares</w:t>
+        <w:t>partial_qty   = floor(300 × 33%) = 99 shares per R-partial</w:t>
         <w:br/>
         <w:t>residual_qty  = 300 − 2 × 99 = 102 shares (trails)</w:t>
+      </w:r>
+    </w:p>
+    <w:p>
+      <w:r>
+        <w:rPr>
+          <w:b w:val="0"/>
+          <w:i/>
+        </w:rPr>
+        <w:t>Because 1st formal partial sits at +12.0% (above +10%), the EARLY_TRAIL rule will fire FIRST on any trade that crosses +10%. The trail arms and the stop floors at entry well before the formal partial target.</w:t>
       </w:r>
     </w:p>
     <w:p>
@@ -4295,7 +5607,7 @@
           <w:b w:val="0"/>
           <w:i w:val="0"/>
         </w:rPr>
-        <w:t>At +2R (₹560.00) → 1st partial; stop → breakeven. At +4R (₹620.00) → 2nd partial; trail armed. Residual trails out at +9R (₹770).</w:t>
+        <w:t>Price rallies. At +10% (₹550), EARLY_TRAIL arms early — stop floors at entry, trail starts ratcheting daily. At ₹560.00 (+2R) the 1st partial fires. At ₹620.00 (+4R) the 2nd partial fires. Residual 102 shares ride the trail until it catches at ~+9R (₹770).</w:t>
       </w:r>
     </w:p>
     <w:tbl>
@@ -4379,6 +5691,73 @@
                 <w:sz w:val="20"/>
               </w:rPr>
               <w:t>Cumulative P&amp;L</w:t>
+            </w:r>
+          </w:p>
+        </w:tc>
+      </w:tr>
+      <w:tr>
+        <w:tc>
+          <w:tcPr>
+            <w:tcW w:type="dxa" w:w="3402"/>
+          </w:tcPr>
+          <w:p>
+            <w:r>
+              <w:rPr>
+                <w:sz w:val="20"/>
+              </w:rPr>
+              <w:t>EARLY_TRAIL armed @ +10%</w:t>
+            </w:r>
+          </w:p>
+        </w:tc>
+        <w:tc>
+          <w:tcPr>
+            <w:tcW w:type="dxa" w:w="1417"/>
+          </w:tcPr>
+          <w:p>
+            <w:r>
+              <w:rPr>
+                <w:sz w:val="20"/>
+              </w:rPr>
+              <w:t>₹550.00</w:t>
+            </w:r>
+          </w:p>
+        </w:tc>
+        <w:tc>
+          <w:tcPr>
+            <w:tcW w:type="dxa" w:w="1134"/>
+          </w:tcPr>
+          <w:p>
+            <w:r>
+              <w:rPr>
+                <w:sz w:val="20"/>
+              </w:rPr>
+              <w:t>—</w:t>
+            </w:r>
+          </w:p>
+        </w:tc>
+        <w:tc>
+          <w:tcPr>
+            <w:tcW w:type="dxa" w:w="1701"/>
+          </w:tcPr>
+          <w:p>
+            <w:r>
+              <w:rPr>
+                <w:sz w:val="20"/>
+              </w:rPr>
+              <w:t>(no booking)</w:t>
+            </w:r>
+          </w:p>
+        </w:tc>
+        <w:tc>
+          <w:tcPr>
+            <w:tcW w:type="dxa" w:w="1984"/>
+          </w:tcPr>
+          <w:p>
+            <w:r>
+              <w:rPr>
+                <w:sz w:val="20"/>
+              </w:rPr>
+              <w:t>₹0</w:t>
             </w:r>
           </w:p>
         </w:tc>
@@ -4611,7 +5990,7 @@
           <w:b w:val="0"/>
           <w:i w:val="0"/>
         </w:rPr>
-        <w:t>Hits +2R, 1st partial fires, BE stop catches the pullback.</w:t>
+        <w:t>Hits +2R (₹560.00), 1st partial fires (33% booked, breakeven armed). Trail also armed early at +10% on the way up, so stop is already trailing. Price reverses, trailing stop catches around breakeven on the remaining qty.</w:t>
       </w:r>
     </w:p>
     <w:tbl>
@@ -4709,7 +6088,7 @@
               <w:rPr>
                 <w:sz w:val="20"/>
               </w:rPr>
-              <w:t>1st partial at +2R</w:t>
+              <w:t>EARLY_TRAIL armed @ +10%</w:t>
             </w:r>
           </w:p>
         </w:tc>
@@ -4722,7 +6101,7 @@
               <w:rPr>
                 <w:sz w:val="20"/>
               </w:rPr>
-              <w:t>₹560.00</w:t>
+              <w:t>₹550.00</w:t>
             </w:r>
           </w:p>
         </w:tc>
@@ -4735,7 +6114,7 @@
               <w:rPr>
                 <w:sz w:val="20"/>
               </w:rPr>
-              <w:t>99</w:t>
+              <w:t>—</w:t>
             </w:r>
           </w:p>
         </w:tc>
@@ -4748,7 +6127,7 @@
               <w:rPr>
                 <w:sz w:val="20"/>
               </w:rPr>
-              <w:t>₹5,940</w:t>
+              <w:t>(no booking)</w:t>
             </w:r>
           </w:p>
         </w:tc>
@@ -4761,7 +6140,7 @@
               <w:rPr>
                 <w:sz w:val="20"/>
               </w:rPr>
-              <w:t>₹5,940</w:t>
+              <w:t>₹0</w:t>
             </w:r>
           </w:p>
         </w:tc>
@@ -4776,7 +6155,74 @@
               <w:rPr>
                 <w:sz w:val="20"/>
               </w:rPr>
-              <w:t>Breakeven stop</w:t>
+              <w:t>1st partial at +2R</w:t>
+            </w:r>
+          </w:p>
+        </w:tc>
+        <w:tc>
+          <w:tcPr>
+            <w:tcW w:type="dxa" w:w="1417"/>
+          </w:tcPr>
+          <w:p>
+            <w:r>
+              <w:rPr>
+                <w:sz w:val="20"/>
+              </w:rPr>
+              <w:t>₹560.00</w:t>
+            </w:r>
+          </w:p>
+        </w:tc>
+        <w:tc>
+          <w:tcPr>
+            <w:tcW w:type="dxa" w:w="1134"/>
+          </w:tcPr>
+          <w:p>
+            <w:r>
+              <w:rPr>
+                <w:sz w:val="20"/>
+              </w:rPr>
+              <w:t>99</w:t>
+            </w:r>
+          </w:p>
+        </w:tc>
+        <w:tc>
+          <w:tcPr>
+            <w:tcW w:type="dxa" w:w="1701"/>
+          </w:tcPr>
+          <w:p>
+            <w:r>
+              <w:rPr>
+                <w:sz w:val="20"/>
+              </w:rPr>
+              <w:t>₹5,940</w:t>
+            </w:r>
+          </w:p>
+        </w:tc>
+        <w:tc>
+          <w:tcPr>
+            <w:tcW w:type="dxa" w:w="1984"/>
+          </w:tcPr>
+          <w:p>
+            <w:r>
+              <w:rPr>
+                <w:sz w:val="20"/>
+              </w:rPr>
+              <w:t>₹5,940</w:t>
+            </w:r>
+          </w:p>
+        </w:tc>
+      </w:tr>
+      <w:tr>
+        <w:tc>
+          <w:tcPr>
+            <w:tcW w:type="dxa" w:w="3402"/>
+          </w:tcPr>
+          <w:p>
+            <w:r>
+              <w:rPr>
+                <w:sz w:val="20"/>
+              </w:rPr>
+              <w:t>Trail stop catches BE</w:t>
             </w:r>
           </w:p>
         </w:tc>
@@ -4854,6 +6300,15 @@
         <w:t>Scenario C — Stopped cold (worst case)</w:t>
       </w:r>
     </w:p>
+    <w:p>
+      <w:r>
+        <w:rPr>
+          <w:b w:val="0"/>
+          <w:i w:val="0"/>
+        </w:rPr>
+        <w:t>Price drops straight to the initial stop. Never reaches +10%, so EARLY_TRAIL never fires.</w:t>
+      </w:r>
+    </w:p>
     <w:tbl>
       <w:tblPr>
         <w:tblStyle w:val="LightGrid-Accent1"/>
@@ -5024,7 +6479,7 @@
         <w:pStyle w:val="Heading2"/>
       </w:pPr>
       <w:r>
-        <w:t>Scenario D — Vertical pop (universal 25%)</w:t>
+        <w:t>Scenario D — Vertical pop (universal 25% rule)</w:t>
       </w:r>
     </w:p>
     <w:p>
@@ -5033,7 +6488,7 @@
           <w:b w:val="0"/>
           <w:i w:val="0"/>
         </w:rPr>
-        <w:t>+25% within 15td → universal book 25% of initial qty; arms breakeven. Trade then runs to +4R and trails out at +9R.</w:t>
+        <w:t>Price gains +25% (to ₹625) within 15 td. EARLY_TRAIL fires at +10% on the way up. Universal book takes 25% of initial qty at ₹625. Trade continues to +R2 (₹620.00) and trails out at +9R (₹770).</w:t>
       </w:r>
     </w:p>
     <w:tbl>
@@ -5117,6 +6572,73 @@
                 <w:sz w:val="20"/>
               </w:rPr>
               <w:t>Cumulative P&amp;L</w:t>
+            </w:r>
+          </w:p>
+        </w:tc>
+      </w:tr>
+      <w:tr>
+        <w:tc>
+          <w:tcPr>
+            <w:tcW w:type="dxa" w:w="3402"/>
+          </w:tcPr>
+          <w:p>
+            <w:r>
+              <w:rPr>
+                <w:sz w:val="20"/>
+              </w:rPr>
+              <w:t>EARLY_TRAIL armed @ +10%</w:t>
+            </w:r>
+          </w:p>
+        </w:tc>
+        <w:tc>
+          <w:tcPr>
+            <w:tcW w:type="dxa" w:w="1417"/>
+          </w:tcPr>
+          <w:p>
+            <w:r>
+              <w:rPr>
+                <w:sz w:val="20"/>
+              </w:rPr>
+              <w:t>₹550.00</w:t>
+            </w:r>
+          </w:p>
+        </w:tc>
+        <w:tc>
+          <w:tcPr>
+            <w:tcW w:type="dxa" w:w="1134"/>
+          </w:tcPr>
+          <w:p>
+            <w:r>
+              <w:rPr>
+                <w:sz w:val="20"/>
+              </w:rPr>
+              <w:t>—</w:t>
+            </w:r>
+          </w:p>
+        </w:tc>
+        <w:tc>
+          <w:tcPr>
+            <w:tcW w:type="dxa" w:w="1701"/>
+          </w:tcPr>
+          <w:p>
+            <w:r>
+              <w:rPr>
+                <w:sz w:val="20"/>
+              </w:rPr>
+              <w:t>(no booking)</w:t>
+            </w:r>
+          </w:p>
+        </w:tc>
+        <w:tc>
+          <w:tcPr>
+            <w:tcW w:type="dxa" w:w="1984"/>
+          </w:tcPr>
+          <w:p>
+            <w:r>
+              <w:rPr>
+                <w:sz w:val="20"/>
+              </w:rPr>
+              <w:t>₹0</w:t>
             </w:r>
           </w:p>
         </w:tc>
@@ -5416,7 +6938,7 @@
           <w:b w:val="0"/>
           <w:i w:val="0"/>
         </w:rPr>
-        <w:t>25td later, price = ₹505 (inside [₹490, ₹510]). Time stop closes everything.</w:t>
+        <w:t>25 td later, price = ₹505 (inside [₹490, ₹510]). Never hit +10% high during the window, so EARLY_TRAIL never fired. Time stop closes everything at close.</w:t>
       </w:r>
     </w:p>
     <w:tbl>
@@ -5582,6 +7104,322 @@
           <w:color w:val="1E40AF"/>
         </w:rPr>
         <w:t>Scenario E total: ₹1,500  (+0.17R)</w:t>
+      </w:r>
+    </w:p>
+    <w:p>
+      <w:pPr>
+        <w:pStyle w:val="Heading2"/>
+      </w:pPr>
+      <w:r>
+        <w:t>Scenario F — Early-trail save (NEW)</w:t>
+      </w:r>
+    </w:p>
+    <w:p>
+      <w:r>
+        <w:rPr>
+          <w:b w:val="0"/>
+          <w:i w:val="0"/>
+        </w:rPr>
+        <w:t>Price pops to bar-high ₹555 (+11% MFE), closes at ₹550 (+10%). EARLY_TRAIL arms: stop floors at entry, trail update sets new stop = 550 − 30 = ₹520 (+4%). Next session price gaps down and trips ₹520 intraday. Railway closes the trade at LTP ₹520. WITHOUT the EARLY_TRAIL rule, this trade would have round-tripped past entry all the way to initial stop ₹470 = −1R.</w:t>
+      </w:r>
+    </w:p>
+    <w:tbl>
+      <w:tblPr>
+        <w:tblStyle w:val="LightGrid-Accent1"/>
+        <w:tblW w:type="auto" w:w="0"/>
+        <w:tblLook w:firstColumn="1" w:firstRow="1" w:lastColumn="0" w:lastRow="0" w:noHBand="0" w:noVBand="1" w:val="04A0"/>
+      </w:tblPr>
+      <w:tblGrid>
+        <w:gridCol w:w="1994"/>
+        <w:gridCol w:w="1994"/>
+        <w:gridCol w:w="1994"/>
+        <w:gridCol w:w="1994"/>
+        <w:gridCol w:w="1994"/>
+      </w:tblGrid>
+      <w:tr>
+        <w:tc>
+          <w:tcPr>
+            <w:tcW w:type="dxa" w:w="3402"/>
+          </w:tcPr>
+          <w:p>
+            <w:r>
+              <w:rPr>
+                <w:b/>
+                <w:sz w:val="20"/>
+              </w:rPr>
+              <w:t>Milestone</w:t>
+            </w:r>
+          </w:p>
+        </w:tc>
+        <w:tc>
+          <w:tcPr>
+            <w:tcW w:type="dxa" w:w="1417"/>
+          </w:tcPr>
+          <w:p>
+            <w:r>
+              <w:rPr>
+                <w:b/>
+                <w:sz w:val="20"/>
+              </w:rPr>
+              <w:t>Price</w:t>
+            </w:r>
+          </w:p>
+        </w:tc>
+        <w:tc>
+          <w:tcPr>
+            <w:tcW w:type="dxa" w:w="1134"/>
+          </w:tcPr>
+          <w:p>
+            <w:r>
+              <w:rPr>
+                <w:b/>
+                <w:sz w:val="20"/>
+              </w:rPr>
+              <w:t>Qty</w:t>
+            </w:r>
+          </w:p>
+        </w:tc>
+        <w:tc>
+          <w:tcPr>
+            <w:tcW w:type="dxa" w:w="1701"/>
+          </w:tcPr>
+          <w:p>
+            <w:r>
+              <w:rPr>
+                <w:b/>
+                <w:sz w:val="20"/>
+              </w:rPr>
+              <w:t>P&amp;L</w:t>
+            </w:r>
+          </w:p>
+        </w:tc>
+        <w:tc>
+          <w:tcPr>
+            <w:tcW w:type="dxa" w:w="1984"/>
+          </w:tcPr>
+          <w:p>
+            <w:r>
+              <w:rPr>
+                <w:b/>
+                <w:sz w:val="20"/>
+              </w:rPr>
+              <w:t>Cumulative P&amp;L</w:t>
+            </w:r>
+          </w:p>
+        </w:tc>
+      </w:tr>
+      <w:tr>
+        <w:tc>
+          <w:tcPr>
+            <w:tcW w:type="dxa" w:w="3402"/>
+          </w:tcPr>
+          <w:p>
+            <w:r>
+              <w:rPr>
+                <w:sz w:val="20"/>
+              </w:rPr>
+              <w:t>MFE hits +11%; EARLY_TRAIL armed</w:t>
+            </w:r>
+          </w:p>
+        </w:tc>
+        <w:tc>
+          <w:tcPr>
+            <w:tcW w:type="dxa" w:w="1417"/>
+          </w:tcPr>
+          <w:p>
+            <w:r>
+              <w:rPr>
+                <w:sz w:val="20"/>
+              </w:rPr>
+              <w:t>₹555.00 high</w:t>
+            </w:r>
+          </w:p>
+        </w:tc>
+        <w:tc>
+          <w:tcPr>
+            <w:tcW w:type="dxa" w:w="1134"/>
+          </w:tcPr>
+          <w:p>
+            <w:r>
+              <w:rPr>
+                <w:sz w:val="20"/>
+              </w:rPr>
+              <w:t>—</w:t>
+            </w:r>
+          </w:p>
+        </w:tc>
+        <w:tc>
+          <w:tcPr>
+            <w:tcW w:type="dxa" w:w="1701"/>
+          </w:tcPr>
+          <w:p>
+            <w:r>
+              <w:rPr>
+                <w:sz w:val="20"/>
+              </w:rPr>
+              <w:t>(no booking)</w:t>
+            </w:r>
+          </w:p>
+        </w:tc>
+        <w:tc>
+          <w:tcPr>
+            <w:tcW w:type="dxa" w:w="1984"/>
+          </w:tcPr>
+          <w:p>
+            <w:r>
+              <w:rPr>
+                <w:sz w:val="20"/>
+              </w:rPr>
+              <w:t>₹0</w:t>
+            </w:r>
+          </w:p>
+        </w:tc>
+      </w:tr>
+      <w:tr>
+        <w:tc>
+          <w:tcPr>
+            <w:tcW w:type="dxa" w:w="3402"/>
+          </w:tcPr>
+          <w:p>
+            <w:r>
+              <w:rPr>
+                <w:sz w:val="20"/>
+              </w:rPr>
+              <w:t>Trail stop set at close − 2×ATR</w:t>
+            </w:r>
+          </w:p>
+        </w:tc>
+        <w:tc>
+          <w:tcPr>
+            <w:tcW w:type="dxa" w:w="1417"/>
+          </w:tcPr>
+          <w:p>
+            <w:r>
+              <w:rPr>
+                <w:sz w:val="20"/>
+              </w:rPr>
+              <w:t>stop = ₹520</w:t>
+            </w:r>
+          </w:p>
+        </w:tc>
+        <w:tc>
+          <w:tcPr>
+            <w:tcW w:type="dxa" w:w="1134"/>
+          </w:tcPr>
+          <w:p>
+            <w:r>
+              <w:rPr>
+                <w:sz w:val="20"/>
+              </w:rPr>
+              <w:t>—</w:t>
+            </w:r>
+          </w:p>
+        </w:tc>
+        <w:tc>
+          <w:tcPr>
+            <w:tcW w:type="dxa" w:w="1701"/>
+          </w:tcPr>
+          <w:p>
+            <w:r>
+              <w:rPr>
+                <w:sz w:val="20"/>
+              </w:rPr>
+              <w:t>—</w:t>
+            </w:r>
+          </w:p>
+        </w:tc>
+        <w:tc>
+          <w:tcPr>
+            <w:tcW w:type="dxa" w:w="1984"/>
+          </w:tcPr>
+          <w:p>
+            <w:r>
+              <w:rPr>
+                <w:sz w:val="20"/>
+              </w:rPr>
+              <w:t>—</w:t>
+            </w:r>
+          </w:p>
+        </w:tc>
+      </w:tr>
+      <w:tr>
+        <w:tc>
+          <w:tcPr>
+            <w:tcW w:type="dxa" w:w="3402"/>
+          </w:tcPr>
+          <w:p>
+            <w:r>
+              <w:rPr>
+                <w:sz w:val="20"/>
+              </w:rPr>
+              <w:t>Next session: trail stop hits</w:t>
+            </w:r>
+          </w:p>
+        </w:tc>
+        <w:tc>
+          <w:tcPr>
+            <w:tcW w:type="dxa" w:w="1417"/>
+          </w:tcPr>
+          <w:p>
+            <w:r>
+              <w:rPr>
+                <w:sz w:val="20"/>
+              </w:rPr>
+              <w:t>₹520.00</w:t>
+            </w:r>
+          </w:p>
+        </w:tc>
+        <w:tc>
+          <w:tcPr>
+            <w:tcW w:type="dxa" w:w="1134"/>
+          </w:tcPr>
+          <w:p>
+            <w:r>
+              <w:rPr>
+                <w:sz w:val="20"/>
+              </w:rPr>
+              <w:t>300</w:t>
+            </w:r>
+          </w:p>
+        </w:tc>
+        <w:tc>
+          <w:tcPr>
+            <w:tcW w:type="dxa" w:w="1701"/>
+          </w:tcPr>
+          <w:p>
+            <w:r>
+              <w:rPr>
+                <w:sz w:val="20"/>
+              </w:rPr>
+              <w:t>₹6,000</w:t>
+            </w:r>
+          </w:p>
+        </w:tc>
+        <w:tc>
+          <w:tcPr>
+            <w:tcW w:type="dxa" w:w="1984"/>
+          </w:tcPr>
+          <w:p>
+            <w:r>
+              <w:rPr>
+                <w:sz w:val="20"/>
+              </w:rPr>
+              <w:t>₹6,000</w:t>
+            </w:r>
+          </w:p>
+        </w:tc>
+      </w:tr>
+    </w:tbl>
+    <w:p>
+      <w:pPr>
+        <w:ind w:left="170"/>
+      </w:pPr>
+      <w:r>
+        <w:rPr>
+          <w:b/>
+          <w:color w:val="1E40AF"/>
+        </w:rPr>
+        <w:t>Scenario F total: ₹6,000  (+0.67R)  |  Without EARLY_TRAIL: ₹-9,000 (−1.00R)  |  Difference: ₹15,000 (+1.67R)</w:t>
       </w:r>
     </w:p>
     <w:p>
@@ -5928,6 +7766,60 @@
                 <w:sz w:val="20"/>
               </w:rPr>
               <w:t>+0.06%</w:t>
+            </w:r>
+          </w:p>
+        </w:tc>
+      </w:tr>
+      <w:tr>
+        <w:tc>
+          <w:tcPr>
+            <w:tcW w:type="dxa" w:w="3402"/>
+          </w:tcPr>
+          <w:p>
+            <w:r>
+              <w:rPr>
+                <w:sz w:val="20"/>
+              </w:rPr>
+              <w:t>F — Early-trail save</w:t>
+            </w:r>
+          </w:p>
+        </w:tc>
+        <w:tc>
+          <w:tcPr>
+            <w:tcW w:type="dxa" w:w="1984"/>
+          </w:tcPr>
+          <w:p>
+            <w:r>
+              <w:rPr>
+                <w:sz w:val="20"/>
+              </w:rPr>
+              <w:t>₹6,000</w:t>
+            </w:r>
+          </w:p>
+        </w:tc>
+        <w:tc>
+          <w:tcPr>
+            <w:tcW w:type="dxa" w:w="1701"/>
+          </w:tcPr>
+          <w:p>
+            <w:r>
+              <w:rPr>
+                <w:sz w:val="20"/>
+              </w:rPr>
+              <w:t>+0.67R</w:t>
+            </w:r>
+          </w:p>
+        </w:tc>
+        <w:tc>
+          <w:tcPr>
+            <w:tcW w:type="dxa" w:w="1701"/>
+          </w:tcPr>
+          <w:p>
+            <w:r>
+              <w:rPr>
+                <w:sz w:val="20"/>
+              </w:rPr>
+              <w:t>+0.24%</w:t>
             </w:r>
           </w:p>
         </w:tc>
@@ -5972,20 +7864,11 @@
       </w:r>
     </w:p>
     <w:p>
-      <w:r>
-        <w:rPr>
-          <w:b w:val="0"/>
-          <w:i/>
-        </w:rPr>
-        <w:t>Cap binds → actual risk ₹6,000 (0.24%) is below the 0.50% target. Expected for low-ATR names — by design.</w:t>
-      </w:r>
-    </w:p>
-    <w:p>
       <w:pPr>
         <w:pStyle w:val="Heading2"/>
       </w:pPr>
       <w:r>
-        <w:t>Stop loss &amp; R-multiple ladder</w:t>
+        <w:t>Stop, R ladder, and early-trail trigger</w:t>
       </w:r>
     </w:p>
     <w:p>
@@ -5997,19 +7880,30 @@
           <w:rFonts w:ascii="Consolas" w:hAnsi="Consolas"/>
           <w:sz w:val="19"/>
         </w:rPr>
-        <w:t>initial_stop  = ₹500 − (2 × ₹15)  = ₹470.00</w:t>
+        <w:t>initial_stop  = ₹500 − (2 × ₹15)  = ₹470.00   (−6% / −1R)</w:t>
         <w:br/>
-        <w:t>R             = ₹500 − ₹470       = ₹30 per share</w:t>
+        <w:t>R             = ₹500 − ₹470       = ₹30 per share  (1R = 6.0% of entry)</w:t>
         <w:br/>
         <w:br/>
-        <w:t>1st partial:  +2R  → ₹500 + (2 × ₹30) = ₹560.00</w:t>
+        <w:t>1st partial:   +2R = ₹560.00  (+12.0%)</w:t>
         <w:br/>
-        <w:t>2nd partial:  +4R  → ₹500 + (4 × ₹30) = ₹620.00</w:t>
+        <w:t>2nd partial:   +4R = ₹620.00  (+24.0%)</w:t>
+        <w:br/>
+        <w:t>EARLY_TRAIL:   +10% = ₹550.00    ← fires BEFORE the 1st R-partial</w:t>
         <w:br/>
         <w:br/>
-        <w:t>partial_qty   = floor(200 × 33%) = 66 shares</w:t>
+        <w:t>partial_qty   = floor(200 × 33%) = 66 shares per R-partial</w:t>
         <w:br/>
         <w:t>residual_qty  = 200 − 2 × 66 = 68 shares (trails)</w:t>
+      </w:r>
+    </w:p>
+    <w:p>
+      <w:r>
+        <w:rPr>
+          <w:b w:val="0"/>
+          <w:i/>
+        </w:rPr>
+        <w:t>Because 1st formal partial sits at +12.0% (above +10%), the EARLY_TRAIL rule will fire FIRST on any trade that crosses +10%. The trail arms and the stop floors at entry well before the formal partial target.</w:t>
       </w:r>
     </w:p>
     <w:p>
@@ -6026,7 +7920,7 @@
           <w:b w:val="0"/>
           <w:i w:val="0"/>
         </w:rPr>
-        <w:t>At +2R (₹560.00) → 1st partial; stop → breakeven. At +4R (₹620.00) → 2nd partial; trail armed. Residual trails out at +9R (₹770).</w:t>
+        <w:t>Price rallies. At +10% (₹550), EARLY_TRAIL arms early — stop floors at entry, trail starts ratcheting daily. At ₹560.00 (+2R) the 1st partial fires. At ₹620.00 (+4R) the 2nd partial fires. Residual 68 shares ride the trail until it catches at ~+9R (₹770).</w:t>
       </w:r>
     </w:p>
     <w:tbl>
@@ -6110,6 +8004,73 @@
                 <w:sz w:val="20"/>
               </w:rPr>
               <w:t>Cumulative P&amp;L</w:t>
+            </w:r>
+          </w:p>
+        </w:tc>
+      </w:tr>
+      <w:tr>
+        <w:tc>
+          <w:tcPr>
+            <w:tcW w:type="dxa" w:w="3402"/>
+          </w:tcPr>
+          <w:p>
+            <w:r>
+              <w:rPr>
+                <w:sz w:val="20"/>
+              </w:rPr>
+              <w:t>EARLY_TRAIL armed @ +10%</w:t>
+            </w:r>
+          </w:p>
+        </w:tc>
+        <w:tc>
+          <w:tcPr>
+            <w:tcW w:type="dxa" w:w="1417"/>
+          </w:tcPr>
+          <w:p>
+            <w:r>
+              <w:rPr>
+                <w:sz w:val="20"/>
+              </w:rPr>
+              <w:t>₹550.00</w:t>
+            </w:r>
+          </w:p>
+        </w:tc>
+        <w:tc>
+          <w:tcPr>
+            <w:tcW w:type="dxa" w:w="1134"/>
+          </w:tcPr>
+          <w:p>
+            <w:r>
+              <w:rPr>
+                <w:sz w:val="20"/>
+              </w:rPr>
+              <w:t>—</w:t>
+            </w:r>
+          </w:p>
+        </w:tc>
+        <w:tc>
+          <w:tcPr>
+            <w:tcW w:type="dxa" w:w="1701"/>
+          </w:tcPr>
+          <w:p>
+            <w:r>
+              <w:rPr>
+                <w:sz w:val="20"/>
+              </w:rPr>
+              <w:t>(no booking)</w:t>
+            </w:r>
+          </w:p>
+        </w:tc>
+        <w:tc>
+          <w:tcPr>
+            <w:tcW w:type="dxa" w:w="1984"/>
+          </w:tcPr>
+          <w:p>
+            <w:r>
+              <w:rPr>
+                <w:sz w:val="20"/>
+              </w:rPr>
+              <w:t>₹0</w:t>
             </w:r>
           </w:p>
         </w:tc>
@@ -6342,7 +8303,7 @@
           <w:b w:val="0"/>
           <w:i w:val="0"/>
         </w:rPr>
-        <w:t>Hits +2R, 1st partial fires, BE stop catches the pullback.</w:t>
+        <w:t>Hits +2R (₹560.00), 1st partial fires (33% booked, breakeven armed). Trail also armed early at +10% on the way up, so stop is already trailing. Price reverses, trailing stop catches around breakeven on the remaining qty.</w:t>
       </w:r>
     </w:p>
     <w:tbl>
@@ -6440,7 +8401,7 @@
               <w:rPr>
                 <w:sz w:val="20"/>
               </w:rPr>
-              <w:t>1st partial at +2R</w:t>
+              <w:t>EARLY_TRAIL armed @ +10%</w:t>
             </w:r>
           </w:p>
         </w:tc>
@@ -6453,7 +8414,7 @@
               <w:rPr>
                 <w:sz w:val="20"/>
               </w:rPr>
-              <w:t>₹560.00</w:t>
+              <w:t>₹550.00</w:t>
             </w:r>
           </w:p>
         </w:tc>
@@ -6466,7 +8427,7 @@
               <w:rPr>
                 <w:sz w:val="20"/>
               </w:rPr>
-              <w:t>66</w:t>
+              <w:t>—</w:t>
             </w:r>
           </w:p>
         </w:tc>
@@ -6479,7 +8440,7 @@
               <w:rPr>
                 <w:sz w:val="20"/>
               </w:rPr>
-              <w:t>₹3,960</w:t>
+              <w:t>(no booking)</w:t>
             </w:r>
           </w:p>
         </w:tc>
@@ -6492,7 +8453,7 @@
               <w:rPr>
                 <w:sz w:val="20"/>
               </w:rPr>
-              <w:t>₹3,960</w:t>
+              <w:t>₹0</w:t>
             </w:r>
           </w:p>
         </w:tc>
@@ -6507,7 +8468,74 @@
               <w:rPr>
                 <w:sz w:val="20"/>
               </w:rPr>
-              <w:t>Breakeven stop</w:t>
+              <w:t>1st partial at +2R</w:t>
+            </w:r>
+          </w:p>
+        </w:tc>
+        <w:tc>
+          <w:tcPr>
+            <w:tcW w:type="dxa" w:w="1417"/>
+          </w:tcPr>
+          <w:p>
+            <w:r>
+              <w:rPr>
+                <w:sz w:val="20"/>
+              </w:rPr>
+              <w:t>₹560.00</w:t>
+            </w:r>
+          </w:p>
+        </w:tc>
+        <w:tc>
+          <w:tcPr>
+            <w:tcW w:type="dxa" w:w="1134"/>
+          </w:tcPr>
+          <w:p>
+            <w:r>
+              <w:rPr>
+                <w:sz w:val="20"/>
+              </w:rPr>
+              <w:t>66</w:t>
+            </w:r>
+          </w:p>
+        </w:tc>
+        <w:tc>
+          <w:tcPr>
+            <w:tcW w:type="dxa" w:w="1701"/>
+          </w:tcPr>
+          <w:p>
+            <w:r>
+              <w:rPr>
+                <w:sz w:val="20"/>
+              </w:rPr>
+              <w:t>₹3,960</w:t>
+            </w:r>
+          </w:p>
+        </w:tc>
+        <w:tc>
+          <w:tcPr>
+            <w:tcW w:type="dxa" w:w="1984"/>
+          </w:tcPr>
+          <w:p>
+            <w:r>
+              <w:rPr>
+                <w:sz w:val="20"/>
+              </w:rPr>
+              <w:t>₹3,960</w:t>
+            </w:r>
+          </w:p>
+        </w:tc>
+      </w:tr>
+      <w:tr>
+        <w:tc>
+          <w:tcPr>
+            <w:tcW w:type="dxa" w:w="3402"/>
+          </w:tcPr>
+          <w:p>
+            <w:r>
+              <w:rPr>
+                <w:sz w:val="20"/>
+              </w:rPr>
+              <w:t>Trail stop catches BE</w:t>
             </w:r>
           </w:p>
         </w:tc>
@@ -6585,6 +8613,15 @@
         <w:t>Scenario C — Stopped cold (worst case)</w:t>
       </w:r>
     </w:p>
+    <w:p>
+      <w:r>
+        <w:rPr>
+          <w:b w:val="0"/>
+          <w:i w:val="0"/>
+        </w:rPr>
+        <w:t>Price drops straight to the initial stop. Never reaches +10%, so EARLY_TRAIL never fires.</w:t>
+      </w:r>
+    </w:p>
     <w:tbl>
       <w:tblPr>
         <w:tblStyle w:val="LightGrid-Accent1"/>
@@ -6755,7 +8792,7 @@
         <w:pStyle w:val="Heading2"/>
       </w:pPr>
       <w:r>
-        <w:t>Scenario D — Vertical pop (universal 25%)</w:t>
+        <w:t>Scenario D — Vertical pop (universal 25% rule)</w:t>
       </w:r>
     </w:p>
     <w:p>
@@ -6764,7 +8801,7 @@
           <w:b w:val="0"/>
           <w:i w:val="0"/>
         </w:rPr>
-        <w:t>+25% within 15td → universal book 25% of initial qty; arms breakeven. Trade then runs to +4R and trails out at +9R.</w:t>
+        <w:t>Price gains +25% (to ₹625) within 15 td. EARLY_TRAIL fires at +10% on the way up. Universal book takes 25% of initial qty at ₹625. Trade continues to +R2 (₹620.00) and trails out at +9R (₹770).</w:t>
       </w:r>
     </w:p>
     <w:tbl>
@@ -6848,6 +8885,73 @@
                 <w:sz w:val="20"/>
               </w:rPr>
               <w:t>Cumulative P&amp;L</w:t>
+            </w:r>
+          </w:p>
+        </w:tc>
+      </w:tr>
+      <w:tr>
+        <w:tc>
+          <w:tcPr>
+            <w:tcW w:type="dxa" w:w="3402"/>
+          </w:tcPr>
+          <w:p>
+            <w:r>
+              <w:rPr>
+                <w:sz w:val="20"/>
+              </w:rPr>
+              <w:t>EARLY_TRAIL armed @ +10%</w:t>
+            </w:r>
+          </w:p>
+        </w:tc>
+        <w:tc>
+          <w:tcPr>
+            <w:tcW w:type="dxa" w:w="1417"/>
+          </w:tcPr>
+          <w:p>
+            <w:r>
+              <w:rPr>
+                <w:sz w:val="20"/>
+              </w:rPr>
+              <w:t>₹550.00</w:t>
+            </w:r>
+          </w:p>
+        </w:tc>
+        <w:tc>
+          <w:tcPr>
+            <w:tcW w:type="dxa" w:w="1134"/>
+          </w:tcPr>
+          <w:p>
+            <w:r>
+              <w:rPr>
+                <w:sz w:val="20"/>
+              </w:rPr>
+              <w:t>—</w:t>
+            </w:r>
+          </w:p>
+        </w:tc>
+        <w:tc>
+          <w:tcPr>
+            <w:tcW w:type="dxa" w:w="1701"/>
+          </w:tcPr>
+          <w:p>
+            <w:r>
+              <w:rPr>
+                <w:sz w:val="20"/>
+              </w:rPr>
+              <w:t>(no booking)</w:t>
+            </w:r>
+          </w:p>
+        </w:tc>
+        <w:tc>
+          <w:tcPr>
+            <w:tcW w:type="dxa" w:w="1984"/>
+          </w:tcPr>
+          <w:p>
+            <w:r>
+              <w:rPr>
+                <w:sz w:val="20"/>
+              </w:rPr>
+              <w:t>₹0</w:t>
             </w:r>
           </w:p>
         </w:tc>
@@ -7147,7 +9251,7 @@
           <w:b w:val="0"/>
           <w:i w:val="0"/>
         </w:rPr>
-        <w:t>25td later, price = ₹505 (inside [₹490, ₹510]). Time stop closes everything.</w:t>
+        <w:t>25 td later, price = ₹505 (inside [₹490, ₹510]). Never hit +10% high during the window, so EARLY_TRAIL never fired. Time stop closes everything at close.</w:t>
       </w:r>
     </w:p>
     <w:tbl>
@@ -7313,6 +9417,322 @@
           <w:color w:val="1E40AF"/>
         </w:rPr>
         <w:t>Scenario E total: ₹1,000  (+0.17R)</w:t>
+      </w:r>
+    </w:p>
+    <w:p>
+      <w:pPr>
+        <w:pStyle w:val="Heading2"/>
+      </w:pPr>
+      <w:r>
+        <w:t>Scenario F — Early-trail save (NEW)</w:t>
+      </w:r>
+    </w:p>
+    <w:p>
+      <w:r>
+        <w:rPr>
+          <w:b w:val="0"/>
+          <w:i w:val="0"/>
+        </w:rPr>
+        <w:t>Price pops to bar-high ₹555 (+11% MFE), closes at ₹550 (+10%). EARLY_TRAIL arms: stop floors at entry, trail update sets new stop = 550 − 30 = ₹520 (+4%). Next session price gaps down and trips ₹520 intraday. Railway closes the trade at LTP ₹520. WITHOUT the EARLY_TRAIL rule, this trade would have round-tripped past entry all the way to initial stop ₹470 = −1R.</w:t>
+      </w:r>
+    </w:p>
+    <w:tbl>
+      <w:tblPr>
+        <w:tblStyle w:val="LightGrid-Accent1"/>
+        <w:tblW w:type="auto" w:w="0"/>
+        <w:tblLook w:firstColumn="1" w:firstRow="1" w:lastColumn="0" w:lastRow="0" w:noHBand="0" w:noVBand="1" w:val="04A0"/>
+      </w:tblPr>
+      <w:tblGrid>
+        <w:gridCol w:w="1994"/>
+        <w:gridCol w:w="1994"/>
+        <w:gridCol w:w="1994"/>
+        <w:gridCol w:w="1994"/>
+        <w:gridCol w:w="1994"/>
+      </w:tblGrid>
+      <w:tr>
+        <w:tc>
+          <w:tcPr>
+            <w:tcW w:type="dxa" w:w="3402"/>
+          </w:tcPr>
+          <w:p>
+            <w:r>
+              <w:rPr>
+                <w:b/>
+                <w:sz w:val="20"/>
+              </w:rPr>
+              <w:t>Milestone</w:t>
+            </w:r>
+          </w:p>
+        </w:tc>
+        <w:tc>
+          <w:tcPr>
+            <w:tcW w:type="dxa" w:w="1417"/>
+          </w:tcPr>
+          <w:p>
+            <w:r>
+              <w:rPr>
+                <w:b/>
+                <w:sz w:val="20"/>
+              </w:rPr>
+              <w:t>Price</w:t>
+            </w:r>
+          </w:p>
+        </w:tc>
+        <w:tc>
+          <w:tcPr>
+            <w:tcW w:type="dxa" w:w="1134"/>
+          </w:tcPr>
+          <w:p>
+            <w:r>
+              <w:rPr>
+                <w:b/>
+                <w:sz w:val="20"/>
+              </w:rPr>
+              <w:t>Qty</w:t>
+            </w:r>
+          </w:p>
+        </w:tc>
+        <w:tc>
+          <w:tcPr>
+            <w:tcW w:type="dxa" w:w="1701"/>
+          </w:tcPr>
+          <w:p>
+            <w:r>
+              <w:rPr>
+                <w:b/>
+                <w:sz w:val="20"/>
+              </w:rPr>
+              <w:t>P&amp;L</w:t>
+            </w:r>
+          </w:p>
+        </w:tc>
+        <w:tc>
+          <w:tcPr>
+            <w:tcW w:type="dxa" w:w="1984"/>
+          </w:tcPr>
+          <w:p>
+            <w:r>
+              <w:rPr>
+                <w:b/>
+                <w:sz w:val="20"/>
+              </w:rPr>
+              <w:t>Cumulative P&amp;L</w:t>
+            </w:r>
+          </w:p>
+        </w:tc>
+      </w:tr>
+      <w:tr>
+        <w:tc>
+          <w:tcPr>
+            <w:tcW w:type="dxa" w:w="3402"/>
+          </w:tcPr>
+          <w:p>
+            <w:r>
+              <w:rPr>
+                <w:sz w:val="20"/>
+              </w:rPr>
+              <w:t>MFE hits +11%; EARLY_TRAIL armed</w:t>
+            </w:r>
+          </w:p>
+        </w:tc>
+        <w:tc>
+          <w:tcPr>
+            <w:tcW w:type="dxa" w:w="1417"/>
+          </w:tcPr>
+          <w:p>
+            <w:r>
+              <w:rPr>
+                <w:sz w:val="20"/>
+              </w:rPr>
+              <w:t>₹555.00 high</w:t>
+            </w:r>
+          </w:p>
+        </w:tc>
+        <w:tc>
+          <w:tcPr>
+            <w:tcW w:type="dxa" w:w="1134"/>
+          </w:tcPr>
+          <w:p>
+            <w:r>
+              <w:rPr>
+                <w:sz w:val="20"/>
+              </w:rPr>
+              <w:t>—</w:t>
+            </w:r>
+          </w:p>
+        </w:tc>
+        <w:tc>
+          <w:tcPr>
+            <w:tcW w:type="dxa" w:w="1701"/>
+          </w:tcPr>
+          <w:p>
+            <w:r>
+              <w:rPr>
+                <w:sz w:val="20"/>
+              </w:rPr>
+              <w:t>(no booking)</w:t>
+            </w:r>
+          </w:p>
+        </w:tc>
+        <w:tc>
+          <w:tcPr>
+            <w:tcW w:type="dxa" w:w="1984"/>
+          </w:tcPr>
+          <w:p>
+            <w:r>
+              <w:rPr>
+                <w:sz w:val="20"/>
+              </w:rPr>
+              <w:t>₹0</w:t>
+            </w:r>
+          </w:p>
+        </w:tc>
+      </w:tr>
+      <w:tr>
+        <w:tc>
+          <w:tcPr>
+            <w:tcW w:type="dxa" w:w="3402"/>
+          </w:tcPr>
+          <w:p>
+            <w:r>
+              <w:rPr>
+                <w:sz w:val="20"/>
+              </w:rPr>
+              <w:t>Trail stop set at close − 2×ATR</w:t>
+            </w:r>
+          </w:p>
+        </w:tc>
+        <w:tc>
+          <w:tcPr>
+            <w:tcW w:type="dxa" w:w="1417"/>
+          </w:tcPr>
+          <w:p>
+            <w:r>
+              <w:rPr>
+                <w:sz w:val="20"/>
+              </w:rPr>
+              <w:t>stop = ₹520</w:t>
+            </w:r>
+          </w:p>
+        </w:tc>
+        <w:tc>
+          <w:tcPr>
+            <w:tcW w:type="dxa" w:w="1134"/>
+          </w:tcPr>
+          <w:p>
+            <w:r>
+              <w:rPr>
+                <w:sz w:val="20"/>
+              </w:rPr>
+              <w:t>—</w:t>
+            </w:r>
+          </w:p>
+        </w:tc>
+        <w:tc>
+          <w:tcPr>
+            <w:tcW w:type="dxa" w:w="1701"/>
+          </w:tcPr>
+          <w:p>
+            <w:r>
+              <w:rPr>
+                <w:sz w:val="20"/>
+              </w:rPr>
+              <w:t>—</w:t>
+            </w:r>
+          </w:p>
+        </w:tc>
+        <w:tc>
+          <w:tcPr>
+            <w:tcW w:type="dxa" w:w="1984"/>
+          </w:tcPr>
+          <w:p>
+            <w:r>
+              <w:rPr>
+                <w:sz w:val="20"/>
+              </w:rPr>
+              <w:t>—</w:t>
+            </w:r>
+          </w:p>
+        </w:tc>
+      </w:tr>
+      <w:tr>
+        <w:tc>
+          <w:tcPr>
+            <w:tcW w:type="dxa" w:w="3402"/>
+          </w:tcPr>
+          <w:p>
+            <w:r>
+              <w:rPr>
+                <w:sz w:val="20"/>
+              </w:rPr>
+              <w:t>Next session: trail stop hits</w:t>
+            </w:r>
+          </w:p>
+        </w:tc>
+        <w:tc>
+          <w:tcPr>
+            <w:tcW w:type="dxa" w:w="1417"/>
+          </w:tcPr>
+          <w:p>
+            <w:r>
+              <w:rPr>
+                <w:sz w:val="20"/>
+              </w:rPr>
+              <w:t>₹520.00</w:t>
+            </w:r>
+          </w:p>
+        </w:tc>
+        <w:tc>
+          <w:tcPr>
+            <w:tcW w:type="dxa" w:w="1134"/>
+          </w:tcPr>
+          <w:p>
+            <w:r>
+              <w:rPr>
+                <w:sz w:val="20"/>
+              </w:rPr>
+              <w:t>200</w:t>
+            </w:r>
+          </w:p>
+        </w:tc>
+        <w:tc>
+          <w:tcPr>
+            <w:tcW w:type="dxa" w:w="1701"/>
+          </w:tcPr>
+          <w:p>
+            <w:r>
+              <w:rPr>
+                <w:sz w:val="20"/>
+              </w:rPr>
+              <w:t>₹4,000</w:t>
+            </w:r>
+          </w:p>
+        </w:tc>
+        <w:tc>
+          <w:tcPr>
+            <w:tcW w:type="dxa" w:w="1984"/>
+          </w:tcPr>
+          <w:p>
+            <w:r>
+              <w:rPr>
+                <w:sz w:val="20"/>
+              </w:rPr>
+              <w:t>₹4,000</w:t>
+            </w:r>
+          </w:p>
+        </w:tc>
+      </w:tr>
+    </w:tbl>
+    <w:p>
+      <w:pPr>
+        <w:ind w:left="170"/>
+      </w:pPr>
+      <w:r>
+        <w:rPr>
+          <w:b/>
+          <w:color w:val="1E40AF"/>
+        </w:rPr>
+        <w:t>Scenario F total: ₹4,000  (+0.67R)  |  Without EARLY_TRAIL: ₹-6,000 (−1.00R)  |  Difference: ₹10,000 (+1.67R)</w:t>
       </w:r>
     </w:p>
     <w:p>
@@ -7663,13 +10083,67 @@
           </w:p>
         </w:tc>
       </w:tr>
+      <w:tr>
+        <w:tc>
+          <w:tcPr>
+            <w:tcW w:type="dxa" w:w="3402"/>
+          </w:tcPr>
+          <w:p>
+            <w:r>
+              <w:rPr>
+                <w:sz w:val="20"/>
+              </w:rPr>
+              <w:t>F — Early-trail save</w:t>
+            </w:r>
+          </w:p>
+        </w:tc>
+        <w:tc>
+          <w:tcPr>
+            <w:tcW w:type="dxa" w:w="1984"/>
+          </w:tcPr>
+          <w:p>
+            <w:r>
+              <w:rPr>
+                <w:sz w:val="20"/>
+              </w:rPr>
+              <w:t>₹4,000</w:t>
+            </w:r>
+          </w:p>
+        </w:tc>
+        <w:tc>
+          <w:tcPr>
+            <w:tcW w:type="dxa" w:w="1701"/>
+          </w:tcPr>
+          <w:p>
+            <w:r>
+              <w:rPr>
+                <w:sz w:val="20"/>
+              </w:rPr>
+              <w:t>+0.67R</w:t>
+            </w:r>
+          </w:p>
+        </w:tc>
+        <w:tc>
+          <w:tcPr>
+            <w:tcW w:type="dxa" w:w="1701"/>
+          </w:tcPr>
+          <w:p>
+            <w:r>
+              <w:rPr>
+                <w:sz w:val="20"/>
+              </w:rPr>
+              <w:t>+0.16%</w:t>
+            </w:r>
+          </w:p>
+        </w:tc>
+      </w:tr>
     </w:tbl>
     <w:p>
       <w:pPr>
         <w:pStyle w:val="Heading1"/>
       </w:pPr>
       <w:r>
-        <w:t>7. Side-by-Side: Same Stock, Same Setup</w:t>
+        <w:t>7. Side-by-Side: Same Stock, All Tiers</w:t>
       </w:r>
     </w:p>
     <w:p>
@@ -7678,7 +10152,7 @@
           <w:b w:val="0"/>
           <w:i w:val="0"/>
         </w:rPr>
-        <w:t>Below is the exact same hypothetical XYZ trade (entry ₹500, ATR ₹15, R = ₹30) sized and run through all 5 scenarios for each tier. Read the columns left-to-right to see how tier choice changes the magnitude of outcomes.</w:t>
+        <w:t>Same hypothetical XYZ trade (entry ₹500, ATR ₹15, R = ₹30) sized and run through all six scenarios for each tier.</w:t>
       </w:r>
     </w:p>
     <w:tbl>
@@ -7977,7 +10451,7 @@
               <w:rPr>
                 <w:sz w:val="20"/>
               </w:rPr>
-              <w:t>1st partial target</w:t>
+              <w:t>1st partial</w:t>
             </w:r>
           </w:p>
         </w:tc>
@@ -8044,7 +10518,7 @@
               <w:rPr>
                 <w:sz w:val="20"/>
               </w:rPr>
-              <w:t>2nd partial target</w:t>
+              <w:t>2nd partial</w:t>
             </w:r>
           </w:p>
         </w:tc>
@@ -8111,7 +10585,7 @@
               <w:rPr>
                 <w:sz w:val="20"/>
               </w:rPr>
-              <w:t>A — Trend works</w:t>
+              <w:t>EARLY_TRAIL</w:t>
             </w:r>
           </w:p>
         </w:tc>
@@ -8124,7 +10598,7 @@
               <w:rPr>
                 <w:sz w:val="20"/>
               </w:rPr>
-              <w:t>₹108,540</w:t>
+              <w:t>₹550 (+10% — fires BEFORE 1st partial)</w:t>
             </w:r>
           </w:p>
         </w:tc>
@@ -8137,7 +10611,7 @@
               <w:rPr>
                 <w:sz w:val="20"/>
               </w:rPr>
-              <w:t>₹75,600</w:t>
+              <w:t>₹550 (+10% — fires BEFORE 1st partial)</w:t>
             </w:r>
           </w:p>
         </w:tc>
@@ -8150,7 +10624,7 @@
               <w:rPr>
                 <w:sz w:val="20"/>
               </w:rPr>
-              <w:t>₹45,360</w:t>
+              <w:t>₹550 (+10% — fires BEFORE 1st partial)</w:t>
             </w:r>
           </w:p>
         </w:tc>
@@ -8163,7 +10637,7 @@
               <w:rPr>
                 <w:sz w:val="20"/>
               </w:rPr>
-              <w:t>₹30,240</w:t>
+              <w:t>₹550 (+10% — fires BEFORE 1st partial)</w:t>
             </w:r>
           </w:p>
         </w:tc>
@@ -8178,7 +10652,7 @@
               <w:rPr>
                 <w:sz w:val="20"/>
               </w:rPr>
-              <w:t>B — Pop &amp; reverse</w:t>
+              <w:t>A — Trend works</w:t>
             </w:r>
           </w:p>
         </w:tc>
@@ -8191,7 +10665,7 @@
               <w:rPr>
                 <w:sz w:val="20"/>
               </w:rPr>
-              <w:t>₹17,820</w:t>
+              <w:t>₹108,540</w:t>
             </w:r>
           </w:p>
         </w:tc>
@@ -8204,7 +10678,7 @@
               <w:rPr>
                 <w:sz w:val="20"/>
               </w:rPr>
-              <w:t>₹9,900</w:t>
+              <w:t>₹75,600</w:t>
             </w:r>
           </w:p>
         </w:tc>
@@ -8217,7 +10691,7 @@
               <w:rPr>
                 <w:sz w:val="20"/>
               </w:rPr>
-              <w:t>₹5,940</w:t>
+              <w:t>₹45,360</w:t>
             </w:r>
           </w:p>
         </w:tc>
@@ -8230,7 +10704,7 @@
               <w:rPr>
                 <w:sz w:val="20"/>
               </w:rPr>
-              <w:t>₹3,960</w:t>
+              <w:t>₹30,240</w:t>
             </w:r>
           </w:p>
         </w:tc>
@@ -8245,7 +10719,7 @@
               <w:rPr>
                 <w:sz w:val="20"/>
               </w:rPr>
-              <w:t>C — Stopped cold</w:t>
+              <w:t>B — Pop &amp; reverse</w:t>
             </w:r>
           </w:p>
         </w:tc>
@@ -8258,7 +10732,7 @@
               <w:rPr>
                 <w:sz w:val="20"/>
               </w:rPr>
-              <w:t>₹-18,000</w:t>
+              <w:t>₹17,820</w:t>
             </w:r>
           </w:p>
         </w:tc>
@@ -8271,7 +10745,7 @@
               <w:rPr>
                 <w:sz w:val="20"/>
               </w:rPr>
-              <w:t>₹-15,000</w:t>
+              <w:t>₹9,900</w:t>
             </w:r>
           </w:p>
         </w:tc>
@@ -8284,7 +10758,7 @@
               <w:rPr>
                 <w:sz w:val="20"/>
               </w:rPr>
-              <w:t>₹-9,000</w:t>
+              <w:t>₹5,940</w:t>
             </w:r>
           </w:p>
         </w:tc>
@@ -8297,7 +10771,7 @@
               <w:rPr>
                 <w:sz w:val="20"/>
               </w:rPr>
-              <w:t>₹-6,000</w:t>
+              <w:t>₹3,960</w:t>
             </w:r>
           </w:p>
         </w:tc>
@@ -8312,7 +10786,7 @@
               <w:rPr>
                 <w:sz w:val="20"/>
               </w:rPr>
-              <w:t>D — Vertical pop</w:t>
+              <w:t>C — Stopped cold</w:t>
             </w:r>
           </w:p>
         </w:tc>
@@ -8325,7 +10799,7 @@
               <w:rPr>
                 <w:sz w:val="20"/>
               </w:rPr>
-              <w:t>₹86,790</w:t>
+              <w:t>₹-18,000</w:t>
             </w:r>
           </w:p>
         </w:tc>
@@ -8338,7 +10812,7 @@
               <w:rPr>
                 <w:sz w:val="20"/>
               </w:rPr>
-              <w:t>₹57,475</w:t>
+              <w:t>₹-15,000</w:t>
             </w:r>
           </w:p>
         </w:tc>
@@ -8351,7 +10825,7 @@
               <w:rPr>
                 <w:sz w:val="20"/>
               </w:rPr>
-              <w:t>₹34,485</w:t>
+              <w:t>₹-9,000</w:t>
             </w:r>
           </w:p>
         </w:tc>
@@ -8364,7 +10838,7 @@
               <w:rPr>
                 <w:sz w:val="20"/>
               </w:rPr>
-              <w:t>₹22,990</w:t>
+              <w:t>₹-6,000</w:t>
             </w:r>
           </w:p>
         </w:tc>
@@ -8379,6 +10853,73 @@
               <w:rPr>
                 <w:sz w:val="20"/>
               </w:rPr>
+              <w:t>D — Vertical pop</w:t>
+            </w:r>
+          </w:p>
+        </w:tc>
+        <w:tc>
+          <w:tcPr>
+            <w:tcW w:type="dxa" w:w="1701"/>
+          </w:tcPr>
+          <w:p>
+            <w:r>
+              <w:rPr>
+                <w:sz w:val="20"/>
+              </w:rPr>
+              <w:t>₹86,790</w:t>
+            </w:r>
+          </w:p>
+        </w:tc>
+        <w:tc>
+          <w:tcPr>
+            <w:tcW w:type="dxa" w:w="1701"/>
+          </w:tcPr>
+          <w:p>
+            <w:r>
+              <w:rPr>
+                <w:sz w:val="20"/>
+              </w:rPr>
+              <w:t>₹57,475</w:t>
+            </w:r>
+          </w:p>
+        </w:tc>
+        <w:tc>
+          <w:tcPr>
+            <w:tcW w:type="dxa" w:w="1701"/>
+          </w:tcPr>
+          <w:p>
+            <w:r>
+              <w:rPr>
+                <w:sz w:val="20"/>
+              </w:rPr>
+              <w:t>₹34,485</w:t>
+            </w:r>
+          </w:p>
+        </w:tc>
+        <w:tc>
+          <w:tcPr>
+            <w:tcW w:type="dxa" w:w="1701"/>
+          </w:tcPr>
+          <w:p>
+            <w:r>
+              <w:rPr>
+                <w:sz w:val="20"/>
+              </w:rPr>
+              <w:t>₹22,990</w:t>
+            </w:r>
+          </w:p>
+        </w:tc>
+      </w:tr>
+      <w:tr>
+        <w:tc>
+          <w:tcPr>
+            <w:tcW w:type="dxa" w:w="2551"/>
+          </w:tcPr>
+          <w:p>
+            <w:r>
+              <w:rPr>
+                <w:sz w:val="20"/>
+              </w:rPr>
               <w:t>E — Time stop</w:t>
             </w:r>
           </w:p>
@@ -8432,6 +10973,73 @@
                 <w:sz w:val="20"/>
               </w:rPr>
               <w:t>₹1,000</w:t>
+            </w:r>
+          </w:p>
+        </w:tc>
+      </w:tr>
+      <w:tr>
+        <w:tc>
+          <w:tcPr>
+            <w:tcW w:type="dxa" w:w="2551"/>
+          </w:tcPr>
+          <w:p>
+            <w:r>
+              <w:rPr>
+                <w:sz w:val="20"/>
+              </w:rPr>
+              <w:t>F — Early-trail save</w:t>
+            </w:r>
+          </w:p>
+        </w:tc>
+        <w:tc>
+          <w:tcPr>
+            <w:tcW w:type="dxa" w:w="1701"/>
+          </w:tcPr>
+          <w:p>
+            <w:r>
+              <w:rPr>
+                <w:sz w:val="20"/>
+              </w:rPr>
+              <w:t>₹12,000</w:t>
+            </w:r>
+          </w:p>
+        </w:tc>
+        <w:tc>
+          <w:tcPr>
+            <w:tcW w:type="dxa" w:w="1701"/>
+          </w:tcPr>
+          <w:p>
+            <w:r>
+              <w:rPr>
+                <w:sz w:val="20"/>
+              </w:rPr>
+              <w:t>₹10,000</w:t>
+            </w:r>
+          </w:p>
+        </w:tc>
+        <w:tc>
+          <w:tcPr>
+            <w:tcW w:type="dxa" w:w="1701"/>
+          </w:tcPr>
+          <w:p>
+            <w:r>
+              <w:rPr>
+                <w:sz w:val="20"/>
+              </w:rPr>
+              <w:t>₹6,000</w:t>
+            </w:r>
+          </w:p>
+        </w:tc>
+        <w:tc>
+          <w:tcPr>
+            <w:tcW w:type="dxa" w:w="1701"/>
+          </w:tcPr>
+          <w:p>
+            <w:r>
+              <w:rPr>
+                <w:sz w:val="20"/>
+              </w:rPr>
+              <w:t>₹4,000</w:t>
             </w:r>
           </w:p>
         </w:tc>
@@ -8452,7 +11060,7 @@
         <w:ind w:left="340"/>
       </w:pPr>
       <w:r>
-        <w:t>For this stock (low ATR, ₹500 price), the notional cap binds on ALL four tiers. That means actual risk per trade is well below the tier's risk_pct target — and differences between tiers in this example come almost entirely from the cap, not from the dollar-risk %.</w:t>
+        <w:t>For this ₹500 / ATR ₹15 stock, EARLY_TRAIL at +10% sits BELOW the formal 1st partial for every tier (T1 = +18%, T2/T3/T4 = +12%). So in every winning scenario, the trail arms first and locks in entry as the worst case before any R-target fires.</w:t>
       </w:r>
     </w:p>
     <w:p>
@@ -8461,7 +11069,7 @@
         <w:ind w:left="340"/>
       </w:pPr>
       <w:r>
-        <w:t>T1 not only has the largest position but also a higher R-multiple ladder (+3R/+6R), so its winning scenarios are dramatically bigger than T4's. T1 Scenario A is roughly 3× the rupee P&amp;L of T4 Scenario A.</w:t>
+        <w:t>Scenario F is the new mechanic to watch. Without EARLY_TRAIL, every tier would have lost −1R (its full dollar risk) on this trade. With the rule, every tier exits at +4% = roughly +2/3R. Difference per trade: T1 saves ₹27,000, T4 saves ₹9,000.</w:t>
       </w:r>
     </w:p>
     <w:p>
@@ -8470,7 +11078,7 @@
         <w:ind w:left="340"/>
       </w:pPr>
       <w:r>
-        <w:t>The worst case (C) scales linearly with position size. T4's worst loss is just over ₹6,000 vs T1's ₹18,000 — exactly proportional to qty, which is the whole point of smaller positions for less-conviction tiers.</w:t>
+        <w:t>Scenarios A and D look identical to v1 in P&amp;L terms — the trail catches at the same +9R level regardless of when it armed. The difference is only visible on trades that fail to reach the formal R-partials (Scenario F).</w:t>
       </w:r>
     </w:p>
     <w:p>
@@ -8479,7 +11087,7 @@
         <w:ind w:left="340"/>
       </w:pPr>
       <w:r>
-        <w:t>Scenario B (BE pullback) leaves you with a small win on the 1st partial and zero on the rest — a 'free look' outcome. Across many trades this dampens drawdown.</w:t>
+        <w:t>Worst case (C) is unchanged. The trade has to actually print +10% before EARLY_TRAIL can fire; a direct drop to the stop never crosses that threshold.</w:t>
       </w:r>
     </w:p>
     <w:p>
@@ -8496,7 +11104,7 @@
           <w:b w:val="0"/>
           <w:i w:val="0"/>
         </w:rPr>
-        <w:t>All numbers above assume ATR = 3% of price (mid/large cap behavior). For a higher-ATR name, stop_dist gets bigger, which means qty_by_risk drops AND the partial targets live further away in rupee terms. Let's run the same exercise on a more volatile stock:</w:t>
+        <w:t>All numbers above assume ATR = 3% of price. For a higher-ATR name, stop_dist gets bigger AND partial targets live further away. Here is where EARLY_TRAIL really earns its keep — without it, the geometry is genuinely broken for high-ATR T1.</w:t>
       </w:r>
     </w:p>
     <w:p>
@@ -8516,9 +11124,24 @@
         <w:br/>
         <w:t xml:space="preserve">  stop_dist  (2 × ATR)    = ₹80.00</w:t>
         <w:br/>
-        <w:t xml:space="preserve">  initial_stop            = ₹420.00</w:t>
+        <w:t xml:space="preserve">  initial_stop            = ₹420.00      (−16% / −1R)</w:t>
         <w:br/>
-        <w:t xml:space="preserve">  R                       = ₹80 per share</w:t>
+        <w:t xml:space="preserve">  R                       = ₹80 per share  (1R = 16% of entry)</w:t>
+        <w:br/>
+        <w:t xml:space="preserve">  1st partial T1 (3R)     = ₹740          (+48%)</w:t>
+        <w:br/>
+        <w:t xml:space="preserve">  1st partial T2/T3/T4    = ₹660          (+32%)</w:t>
+        <w:br/>
+        <w:t xml:space="preserve">  EARLY_TRAIL trigger     = ₹550          (+10% — fires WELL before any partial)</w:t>
+      </w:r>
+    </w:p>
+    <w:p>
+      <w:r>
+        <w:rPr>
+          <w:b w:val="0"/>
+          <w:i w:val="0"/>
+        </w:rPr>
+        <w:t>In this scenario the formal R-ladder is so far out that without EARLY_TRAIL almost every trade that fails to make a 32-48% run would round-trip to −16%. With EARLY_TRAIL, any trade that prints +10% locks in entry as the floor; from there the trail ratchets up 2×ATR (₹80) below close — so the locked-in profit grows as the trade extends.</w:t>
       </w:r>
     </w:p>
     <w:tbl>
@@ -8638,7 +11261,7 @@
         </w:tc>
         <w:tc>
           <w:tcPr>
-            <w:tcW w:type="dxa" w:w="1701"/>
+            <w:tcW w:type="dxa" w:w="1134"/>
           </w:tcPr>
           <w:p>
             <w:r>
@@ -8646,7 +11269,7 @@
                 <w:b/>
                 <w:sz w:val="20"/>
               </w:rPr>
-              <w:t>Position floor</w:t>
+              <w:t>Floor</w:t>
             </w:r>
           </w:p>
         </w:tc>
@@ -8745,7 +11368,7 @@
         </w:tc>
         <w:tc>
           <w:tcPr>
-            <w:tcW w:type="dxa" w:w="1701"/>
+            <w:tcW w:type="dxa" w:w="1134"/>
           </w:tcPr>
           <w:p>
             <w:r>
@@ -8851,7 +11474,7 @@
         </w:tc>
         <w:tc>
           <w:tcPr>
-            <w:tcW w:type="dxa" w:w="1701"/>
+            <w:tcW w:type="dxa" w:w="1134"/>
           </w:tcPr>
           <w:p>
             <w:r>
@@ -8957,7 +11580,7 @@
         </w:tc>
         <w:tc>
           <w:tcPr>
-            <w:tcW w:type="dxa" w:w="1701"/>
+            <w:tcW w:type="dxa" w:w="1134"/>
           </w:tcPr>
           <w:p>
             <w:r>
@@ -9063,7 +11686,7 @@
         </w:tc>
         <w:tc>
           <w:tcPr>
-            <w:tcW w:type="dxa" w:w="1701"/>
+            <w:tcW w:type="dxa" w:w="1134"/>
           </w:tcPr>
           <w:p>
             <w:r>
@@ -9079,10 +11702,90 @@
     <w:p>
       <w:r>
         <w:rPr>
+          <w:b/>
+          <w:i w:val="0"/>
+        </w:rPr>
+        <w:t>Scenario F (early-trail save) on this volatile stock:</w:t>
+      </w:r>
+    </w:p>
+    <w:p>
+      <w:r>
+        <w:rPr>
           <w:b w:val="0"/>
-          <w:i/>
+          <w:i w:val="0"/>
         </w:rPr>
-        <w:t>On a high-ATR name the DOLLAR RISK binds (qty_by_risk &lt; qty_by_cap), and all four tiers end up at full risk %. The notional and qty are much smaller than in the ₹500/₹15-ATR case because the stop is so much wider. This is the intended behavior — volatility-adjusted sizing.</w:t>
+        <w:t>Stock pops to +11% high (₹555), closes at +10% (₹550). EARLY_TRAIL arms: stop = max(stop, entry) = ₹500, then trail update sets new stop = 550 − 80 = ₹470. But ₹470 &lt; ₹500, so stop stays at entry (₹500). Next session the trade gaps down to ₹490 intraday — Railway closes at LTP ₹500 (the breakeven floor). Saved: −1R = −16% of position notional, which on T1 (468 shares × ₹500 = ₹2.34L notional) is ₹37,440. THAT'S the real win of the rule on high-ATR stocks.</w:t>
+      </w:r>
+    </w:p>
+    <w:p>
+      <w:pPr>
+        <w:pStyle w:val="Heading1"/>
+      </w:pPr>
+      <w:r>
+        <w:t>9. MFE / MAE Tracking — What We're Building Toward</w:t>
+      </w:r>
+    </w:p>
+    <w:p>
+      <w:r>
+        <w:rPr>
+          <w:b w:val="0"/>
+          <w:i w:val="0"/>
+        </w:rPr>
+        <w:t>Every open and closed trade now has `max_unrealized_pct` (MFE) and `min_unrealized_pct` (MAE) populated daily. The dashboard surfaces these in both the Open Positions and Closed Trades tables. The Closed Trades table also computes a derived **Peak R** column (= MFE % ÷ R %), so you can immediately see how close a trade got to its formal partial targets.</w:t>
+      </w:r>
+    </w:p>
+    <w:p>
+      <w:r>
+        <w:rPr>
+          <w:b/>
+          <w:i w:val="0"/>
+        </w:rPr>
+        <w:t>After 30-60 days of paper trading we'll have enough data to answer:</w:t>
+      </w:r>
+    </w:p>
+    <w:p>
+      <w:pPr>
+        <w:pStyle w:val="ListBullet"/>
+        <w:ind w:left="340"/>
+      </w:pPr>
+      <w:r>
+        <w:t>Of trades that exited at a loss, what was their median MFE? If it's ≥ +10%, EARLY_TRAIL is well-placed. If it's lower, we might dial the threshold down (say to +7%).</w:t>
+      </w:r>
+    </w:p>
+    <w:p>
+      <w:pPr>
+        <w:pStyle w:val="ListBullet"/>
+        <w:ind w:left="340"/>
+      </w:pPr>
+      <w:r>
+        <w:t>Of trades that hit the 1st R-partial, what fraction reached the 2nd? If it's &lt; 30%, the 2nd partial sits too far out and the trail does most of the work.</w:t>
+      </w:r>
+    </w:p>
+    <w:p>
+      <w:pPr>
+        <w:pStyle w:val="ListBullet"/>
+        <w:ind w:left="340"/>
+      </w:pPr>
+      <w:r>
+        <w:t>For each tier, what's the median Peak R achieved? If T1 trades typically peak at +2.5R while the 1st partial is at +3R, we have a geometry problem.</w:t>
+      </w:r>
+    </w:p>
+    <w:p>
+      <w:pPr>
+        <w:pStyle w:val="ListBullet"/>
+        <w:ind w:left="340"/>
+      </w:pPr>
+      <w:r>
+        <w:t>How does Peak R differ between trail_armed_reason = 'partial_2' vs 'pct_threshold'? That tells us whether EARLY_TRAIL is helping or capping potential trends prematurely.</w:t>
+      </w:r>
+    </w:p>
+    <w:p>
+      <w:pPr>
+        <w:pStyle w:val="ListBullet"/>
+        <w:ind w:left="340"/>
+      </w:pPr>
+      <w:r>
+        <w:t>How does MAE correlate with eventual outcome? If trades that printed MAE ≥ −0.7R rarely come back to win, that's a candidate for a tighter stop.</w:t>
       </w:r>
     </w:p>
     <w:p>
@@ -9091,7 +11794,7 @@
           <w:b w:val="0"/>
           <w:i/>
         </w:rPr>
-        <w:t>Note: T4 on a high-ATR stock ends up with a very small position (~150 shares × ₹500 = ₹78,000 notional). Still above the ₹40,000 floor, so it trades. But if entry_price were lower or risk_pct smaller, the floor could kill the trade entirely.</w:t>
+        <w:t>These are exactly the tuning levers we deferred earlier. The point of the instrument-first approach is that 30 days from now we tune from the MFE/MAE distribution, not from intuition.</w:t>
       </w:r>
     </w:p>
     <w:p>
@@ -9099,51 +11802,7 @@
         <w:pStyle w:val="Heading1"/>
       </w:pPr>
       <w:r>
-        <w:t>9. When a Trade Gets Rejected at Sizing</w:t>
-      </w:r>
-    </w:p>
-    <w:p>
-      <w:r>
-        <w:rPr>
-          <w:b w:val="0"/>
-          <w:i w:val="0"/>
-        </w:rPr>
-        <w:t>Position floor = ₹40,000. The trade is rejected entirely if qty × entry_price &lt; ₹40k. Common rejection paths:</w:t>
-      </w:r>
-    </w:p>
-    <w:p>
-      <w:pPr>
-        <w:pStyle w:val="ListBullet"/>
-        <w:ind w:left="340"/>
-      </w:pPr>
-      <w:r>
-        <w:t>High-priced low-ATR name where the cap forces a tiny qty. Example: ₹5,000 share, ATR ₹30. T4 cap = ₹1L → qty_by_cap = 20. Notional = 20 × ₹5,000 = ₹1,00,000 — actually fine. But for T4 you'd be at full cap on a single share count of 20.</w:t>
-      </w:r>
-    </w:p>
-    <w:p>
-      <w:pPr>
-        <w:pStyle w:val="ListBullet"/>
-        <w:ind w:left="340"/>
-      </w:pPr>
-      <w:r>
-        <w:t>Very high-ATR name where dollar risk forces qty into low single digits. Example: ₹500 share, ATR ₹100 (20%). T4: risk_inr = ₹12,500. qty_by_risk = floor(12500 / 200) = 62. Notional = ₹31,000 &lt; ₹40,000 → REJECT. Trade never gets placed.</w:t>
-      </w:r>
-    </w:p>
-    <w:p>
-      <w:pPr>
-        <w:pStyle w:val="ListBullet"/>
-        <w:ind w:left="340"/>
-      </w:pPr>
-      <w:r>
-        <w:t>Sector concentration. If the new trade's notional would push the sector total over 25% × ₹25L = ₹6,25,000, the trade is rejected (regardless of sizing). This is checked AFTER sizing — the candidate is skipped and we move to the next.</w:t>
-      </w:r>
-    </w:p>
-    <w:p>
-      <w:pPr>
-        <w:pStyle w:val="Heading1"/>
-      </w:pPr>
-      <w:r>
-        <w:t>10. Exit Reason Codes (what you'll see in the Closed Trades table)</w:t>
+        <w:t>10. Exit Reason Codes</w:t>
       </w:r>
     </w:p>
     <w:tbl>
@@ -9174,7 +11833,7 @@
         </w:tc>
         <w:tc>
           <w:tcPr>
-            <w:tcW w:type="dxa" w:w="2551"/>
+            <w:tcW w:type="dxa" w:w="2268"/>
           </w:tcPr>
           <w:p>
             <w:r>
@@ -9217,7 +11876,7 @@
         </w:tc>
         <w:tc>
           <w:tcPr>
-            <w:tcW w:type="dxa" w:w="2551"/>
+            <w:tcW w:type="dxa" w:w="2268"/>
           </w:tcPr>
           <w:p>
             <w:r>
@@ -9258,7 +11917,7 @@
         </w:tc>
         <w:tc>
           <w:tcPr>
-            <w:tcW w:type="dxa" w:w="2551"/>
+            <w:tcW w:type="dxa" w:w="2268"/>
           </w:tcPr>
           <w:p>
             <w:r>
@@ -9278,7 +11937,7 @@
               <w:rPr>
                 <w:sz w:val="20"/>
               </w:rPr>
-              <w:t>Stop hit AFTER trail was armed (i.e. after 2nd partial). Scenario A's tail.</w:t>
+              <w:t>Stop hit AFTER trail was armed (formal 2nd partial OR EARLY_TRAIL). Scenario A's tail, Scenario F.</w:t>
             </w:r>
           </w:p>
         </w:tc>
@@ -9299,7 +11958,7 @@
         </w:tc>
         <w:tc>
           <w:tcPr>
-            <w:tcW w:type="dxa" w:w="2551"/>
+            <w:tcW w:type="dxa" w:w="2268"/>
           </w:tcPr>
           <w:p>
             <w:r>
@@ -9340,7 +11999,7 @@
         </w:tc>
         <w:tc>
           <w:tcPr>
-            <w:tcW w:type="dxa" w:w="2551"/>
+            <w:tcW w:type="dxa" w:w="2268"/>
           </w:tcPr>
           <w:p>
             <w:r>
@@ -9381,7 +12040,7 @@
         </w:tc>
         <w:tc>
           <w:tcPr>
-            <w:tcW w:type="dxa" w:w="2551"/>
+            <w:tcW w:type="dxa" w:w="2268"/>
           </w:tcPr>
           <w:p>
             <w:r>
@@ -9401,7 +12060,7 @@
               <w:rPr>
                 <w:sz w:val="20"/>
               </w:rPr>
-              <w:t>Pending row aged &gt; 2 trading days with no live tick — never got filled.</w:t>
+              <w:t>Pending row aged &gt; 2 trading days with no live tick.</w:t>
             </w:r>
           </w:p>
         </w:tc>
@@ -9422,7 +12081,7 @@
         </w:tc>
         <w:tc>
           <w:tcPr>
-            <w:tcW w:type="dxa" w:w="2551"/>
+            <w:tcW w:type="dxa" w:w="2268"/>
           </w:tcPr>
           <w:p>
             <w:r>
@@ -9463,7 +12122,7 @@
         </w:tc>
         <w:tc>
           <w:tcPr>
-            <w:tcW w:type="dxa" w:w="2551"/>
+            <w:tcW w:type="dxa" w:w="2268"/>
           </w:tcPr>
           <w:p>
             <w:r>
@@ -9483,12 +12142,21 @@
               <w:rPr>
                 <w:sz w:val="20"/>
               </w:rPr>
-              <w:t>entry_atr was null on the pending row (data quality issue — shouldn't happen).</w:t>
+              <w:t>entry_atr was null on the pending row (data quality issue).</w:t>
             </w:r>
           </w:p>
         </w:tc>
       </w:tr>
     </w:tbl>
+    <w:p>
+      <w:r>
+        <w:rPr>
+          <w:b w:val="0"/>
+          <w:i w:val="0"/>
+        </w:rPr>
+        <w:t>Tip: when exit_reason='trail_stop', check trail_armed_reason on the row to know whether the trail came from a formal 2nd partial ('partial_2') or from EARLY_TRAIL ('pct_threshold'). The Peak R column tells you how far the trade actually ran.</w:t>
+      </w:r>
+    </w:p>
     <w:sectPr>
       <w:pgSz w:w="12240" w:h="15840"/>
       <w:pgMar w:top="1134" w:right="1134" w:bottom="1134" w:left="1134" w:header="720" w:footer="720" w:gutter="0"/>

</xml_diff>